<commit_message>
fix(invoice): gunakan format surat tagihan, bukan kuitansi
Template diganti dari kuitansi ke draf tagihan formal; preview HTML + patch docx perihal kompensasi sewa.
</commit_message>
<xml_diff>
--- a/public/invoice/template_invoice_kompensasi.docx
+++ b/public/invoice/template_invoice_kompensasi.docx
@@ -4,289 +4,452 @@
   <w:body>
     <w:p>
       <w:pPr>
+        <w:tabs>
+          <w:tab w:val="left" w:pos="1418"/>
+          <w:tab w:val="left" w:pos="1701"/>
+        </w:tabs>
         <w:spacing w:after="0" w:line="276" w:lineRule="auto"/>
-        <w:jc w:val="center"/>
+        <w:ind w:left="1701" w:hanging="1701"/>
+        <w:jc w:val="right"/>
+        <w:rPr>
+          <w:bCs/>
+        </w:rPr>
+      </w:pPr>
+      <w:r>
+        <w:rPr>
+          <w:bCs/>
+        </w:rPr>
+        <w:t xml:space="preserve">Makassar, </w:t>
+      </w:r>
+      <w:r>
+        <w:rPr>
+          <w:bCs/>
+        </w:rPr>
+        <w:t>..........</w:t>
+      </w:r>
+    </w:p>
+    <w:p>
+      <w:pPr>
+        <w:spacing w:after="0" w:line="276" w:lineRule="auto"/>
+        <w:jc w:val="both"/>
+      </w:pPr>
+      <w:r>
+        <w:t>Nomor</w:t>
+      </w:r>
+      <w:r>
+        <w:tab/>
+      </w:r>
+      <w:r>
+        <w:tab/>
+        <w:t xml:space="preserve">: </w:t>
+      </w:r>
+    </w:p>
+    <w:p>
+      <w:pPr>
+        <w:spacing w:after="0" w:line="276" w:lineRule="auto"/>
+        <w:jc w:val="both"/>
+      </w:pPr>
+      <w:r>
+        <w:t xml:space="preserve">Lampiran </w:t>
+      </w:r>
+      <w:r>
+        <w:tab/>
+        <w:t xml:space="preserve">: </w:t>
+      </w:r>
+    </w:p>
+    <w:p>
+      <w:pPr>
+        <w:spacing w:after="0" w:line="276" w:lineRule="auto"/>
+        <w:jc w:val="both"/>
+      </w:pPr>
+      <w:r>
+        <w:t>Perihal</w:t>
+      </w:r>
+      <w:r>
+        <w:tab/>
+      </w:r>
+      <w:r>
+        <w:tab/>
+        <w:t xml:space="preserve">: </w:t>
+      </w:r>
+      <w:r>
+        <w:t xml:space="preserve">Penagihan </w:t>
+      </w:r>
+      <w:r>
+        <w:t xml:space="preserve">Pembayaran </w:t>
+      </w:r>
+      <w:r>
+        <w:t>Pajak Bumi dan Bangunan (PBB)</w:t>
+      </w:r>
+      <w:r>
+        <w:t xml:space="preserve"> [Nama Objek Kerja Sama]</w:t>
+      </w:r>
+    </w:p>
+    <w:p>
+      <w:pPr>
+        <w:spacing w:after="0" w:line="276" w:lineRule="auto"/>
+        <w:jc w:val="both"/>
+      </w:pPr>
+    </w:p>
+    <w:p>
+      <w:pPr>
+        <w:spacing w:after="0" w:line="276" w:lineRule="auto"/>
+        <w:jc w:val="both"/>
+      </w:pPr>
+      <w:r>
+        <w:t>Kepada Yth.</w:t>
+      </w:r>
+    </w:p>
+    <w:p>
+      <w:pPr>
+        <w:spacing w:after="0" w:line="276" w:lineRule="auto"/>
+        <w:jc w:val="both"/>
         <w:rPr>
           <w:b/>
           <w:bCs/>
-          <w:u w:val="single"/>
         </w:rPr>
       </w:pPr>
       <w:r>
         <w:rPr>
           <w:b/>
           <w:bCs/>
-          <w:u w:val="single"/>
         </w:rPr>
-        <w:t>KUITANSI</w:t>
+        <w:t>(</w:t>
+      </w:r>
+      <w:r>
+        <w:rPr>
+          <w:b/>
+          <w:bCs/>
+        </w:rPr>
+        <w:t xml:space="preserve">Jabatan </w:t>
+      </w:r>
+      <w:r>
+        <w:rPr>
+          <w:b/>
+          <w:bCs/>
+        </w:rPr>
+        <w:t>Pimpinan</w:t>
+      </w:r>
+      <w:r>
+        <w:rPr>
+          <w:b/>
+          <w:bCs/>
+        </w:rPr>
+        <w:t>/kalau perorangan kosongi</w:t>
+      </w:r>
+      <w:r>
+        <w:rPr>
+          <w:b/>
+          <w:bCs/>
+        </w:rPr>
+        <w:t>)</w:t>
       </w:r>
     </w:p>
     <w:p>
       <w:pPr>
         <w:spacing w:after="0" w:line="276" w:lineRule="auto"/>
-        <w:ind w:left="1985" w:firstLine="720"/>
-      </w:pPr>
-      <w:r>
-        <w:t xml:space="preserve"> </w:t>
-      </w:r>
-      <w:r>
-        <w:t xml:space="preserve">No.     </w:t>
+        <w:jc w:val="both"/>
+        <w:rPr>
+          <w:b/>
+          <w:bCs/>
+          <w:highlight w:val="yellow"/>
+        </w:rPr>
+      </w:pPr>
+      <w:r>
+        <w:rPr>
+          <w:b/>
+          <w:bCs/>
+          <w:highlight w:val="yellow"/>
+        </w:rPr>
+        <w:t>(Nama Mitra)</w:t>
       </w:r>
     </w:p>
     <w:p>
       <w:pPr>
         <w:spacing w:after="0" w:line="276" w:lineRule="auto"/>
-        <w:jc w:val="center"/>
-      </w:pPr>
+        <w:jc w:val="both"/>
+      </w:pPr>
+      <w:r>
+        <w:rPr>
+          <w:highlight w:val="yellow"/>
+        </w:rPr>
+        <w:t>(Alamat</w:t>
+      </w:r>
+      <w:r>
+        <w:rPr>
+          <w:highlight w:val="yellow"/>
+        </w:rPr>
+        <w:t xml:space="preserve"> Mitra</w:t>
+      </w:r>
+      <w:r>
+        <w:rPr>
+          <w:highlight w:val="yellow"/>
+        </w:rPr>
+        <w:t>)</w:t>
+      </w:r>
+    </w:p>
+    <w:p>
+      <w:pPr>
+        <w:spacing w:after="0" w:line="276" w:lineRule="auto"/>
+        <w:jc w:val="both"/>
+      </w:pPr>
+    </w:p>
+    <w:p>
+      <w:pPr>
+        <w:spacing w:line="276" w:lineRule="auto"/>
+        <w:jc w:val="both"/>
+      </w:pPr>
+      <w:r>
+        <w:t>Dengan hormat</w:t>
+      </w:r>
+      <w:r>
+        <w:t>,</w:t>
+      </w:r>
+    </w:p>
+    <w:p>
+      <w:pPr>
+        <w:spacing w:line="276" w:lineRule="auto"/>
+        <w:jc w:val="both"/>
+      </w:pPr>
+      <w:r>
+        <w:t xml:space="preserve">Menunjuk Perjanjian Kerja Sama Sewa No. </w:t>
+      </w:r>
+      <w:r>
+        <w:rPr>
+          <w:highlight w:val="yellow"/>
+        </w:rPr>
+        <w:t>(Nomor Perjanjian)</w:t>
+      </w:r>
+      <w:r>
+        <w:t xml:space="preserve"> </w:t>
+      </w:r>
+      <w:r>
+        <w:t xml:space="preserve">tanggal </w:t>
+      </w:r>
+      <w:r>
+        <w:rPr>
+          <w:highlight w:val="yellow"/>
+        </w:rPr>
+        <w:t>(Tanggal Perjanjian)</w:t>
+      </w:r>
+      <w:r>
+        <w:t xml:space="preserve"> tentang Pemanfaatan Aset yang berlokasi di </w:t>
+      </w:r>
+      <w:r>
+        <w:rPr>
+          <w:highlight w:val="yellow"/>
+        </w:rPr>
+        <w:t>(Alamat aset yang dikerjasamakan)</w:t>
+      </w:r>
+      <w:r>
+        <w:rPr>
+          <w:highlight w:val="yellow"/>
+        </w:rPr>
+        <w:t>,</w:t>
+      </w:r>
+      <w:r>
+        <w:t xml:space="preserve"> dengan ini kami </w:t>
+      </w:r>
+      <w:r>
+        <w:t>sampaikan</w:t>
+      </w:r>
+      <w:r>
+        <w:t xml:space="preserve"> tagihan pembayaran Pajak Bumi dan Bangunan (PBB), dengan rincian sebagai berikut:</w:t>
+      </w:r>
     </w:p>
     <w:tbl>
       <w:tblPr>
         <w:tblStyle w:val="TableGrid"/>
-        <w:tblW w:w="0" w:type="auto"/>
-        <w:tblBorders>
-          <w:top w:val="none" w:sz="0" w:space="0" w:color="auto"/>
-          <w:left w:val="none" w:sz="0" w:space="0" w:color="auto"/>
-          <w:bottom w:val="none" w:sz="0" w:space="0" w:color="auto"/>
-          <w:right w:val="none" w:sz="0" w:space="0" w:color="auto"/>
-          <w:insideH w:val="none" w:sz="0" w:space="0" w:color="auto"/>
-          <w:insideV w:val="none" w:sz="0" w:space="0" w:color="auto"/>
-        </w:tblBorders>
+        <w:tblW w:w="9469" w:type="dxa"/>
+        <w:tblInd w:w="-5" w:type="dxa"/>
         <w:tblLook w:val="04A0" w:firstRow="1" w:lastRow="0" w:firstColumn="1" w:lastColumn="0" w:noHBand="0" w:noVBand="1"/>
       </w:tblPr>
       <w:tblGrid>
-        <w:gridCol w:w="2707"/>
-        <w:gridCol w:w="275"/>
-        <w:gridCol w:w="6350"/>
+        <w:gridCol w:w="6033"/>
+        <w:gridCol w:w="3436"/>
       </w:tblGrid>
       <w:tr>
-        <w:trPr>
-          <w:trHeight w:val="720"/>
-        </w:trPr>
         <w:tc>
           <w:tcPr>
-            <w:tcW w:w="2707" w:type="dxa"/>
-            <w:vAlign w:val="center"/>
+            <w:tcW w:w="6033" w:type="dxa"/>
           </w:tcPr>
           <w:p>
             <w:pPr>
               <w:spacing w:line="276" w:lineRule="auto"/>
+              <w:rPr>
+                <w:b/>
+                <w:bCs/>
+                <w:lang w:val="id-ID"/>
+              </w:rPr>
             </w:pPr>
             <w:r>
-              <w:t>Telah Diterima Dari</w:t>
+              <w:rPr>
+                <w:b/>
+                <w:bCs/>
+                <w:lang w:val="id-ID"/>
+              </w:rPr>
+              <w:t>Keterangan</w:t>
             </w:r>
           </w:p>
         </w:tc>
         <w:tc>
           <w:tcPr>
-            <w:tcW w:w="275" w:type="dxa"/>
-            <w:vAlign w:val="center"/>
+            <w:tcW w:w="3436" w:type="dxa"/>
           </w:tcPr>
           <w:p>
             <w:pPr>
               <w:spacing w:line="276" w:lineRule="auto"/>
+              <w:jc w:val="center"/>
+              <w:rPr>
+                <w:b/>
+                <w:bCs/>
+                <w:lang w:val="id-ID"/>
+              </w:rPr>
             </w:pPr>
             <w:r>
-              <w:t>:</w:t>
+              <w:rPr>
+                <w:b/>
+                <w:bCs/>
+                <w:lang w:val="id-ID"/>
+              </w:rPr>
+              <w:t>Nilai (Rp)</w:t>
+            </w:r>
+          </w:p>
+        </w:tc>
+      </w:tr>
+      <w:tr>
+        <w:tc>
+          <w:tcPr>
+            <w:tcW w:w="6033" w:type="dxa"/>
+          </w:tcPr>
+          <w:p>
+            <w:pPr>
+              <w:spacing w:line="276" w:lineRule="auto"/>
+              <w:jc w:val="both"/>
+              <w:rPr>
+                <w:lang w:val="id-ID"/>
+              </w:rPr>
+            </w:pPr>
+            <w:r>
+              <w:rPr>
+                <w:lang w:val="id-ID"/>
+              </w:rPr>
+              <w:t>Pajak Bumi dan Bangunan (PBB) Tahun</w:t>
             </w:r>
           </w:p>
         </w:tc>
         <w:tc>
           <w:tcPr>
-            <w:tcW w:w="6350" w:type="dxa"/>
-            <w:tcBorders>
-              <w:bottom w:val="single" w:sz="4" w:space="0" w:color="auto"/>
-            </w:tcBorders>
-            <w:vAlign w:val="center"/>
+            <w:tcW w:w="3436" w:type="dxa"/>
           </w:tcPr>
           <w:p>
             <w:pPr>
               <w:spacing w:line="276" w:lineRule="auto"/>
+              <w:jc w:val="right"/>
+              <w:rPr>
+                <w:highlight w:val="yellow"/>
+                <w:lang w:val="id-ID"/>
+              </w:rPr>
             </w:pPr>
             <w:r>
-              <w:t>PT Sinergi Perkebunan Nusantara</w:t>
+              <w:rPr>
+                <w:highlight w:val="yellow"/>
+                <w:lang w:val="id-ID"/>
+              </w:rPr>
+              <w:t>Rp......</w:t>
+            </w:r>
+          </w:p>
+        </w:tc>
+      </w:tr>
+      <w:tr>
+        <w:tc>
+          <w:tcPr>
+            <w:tcW w:w="6033" w:type="dxa"/>
+          </w:tcPr>
+          <w:p>
+            <w:pPr>
+              <w:spacing w:line="276" w:lineRule="auto"/>
+              <w:jc w:val="both"/>
+              <w:rPr>
+                <w:lang w:val="id-ID"/>
+              </w:rPr>
+            </w:pPr>
+            <w:r>
+              <w:rPr>
+                <w:lang w:val="id-ID"/>
+              </w:rPr>
+              <w:t>Pajak Bumi dan Bangunan (PBB) Tahun</w:t>
+            </w:r>
+          </w:p>
+        </w:tc>
+        <w:tc>
+          <w:tcPr>
+            <w:tcW w:w="3436" w:type="dxa"/>
+          </w:tcPr>
+          <w:p>
+            <w:pPr>
+              <w:spacing w:line="276" w:lineRule="auto"/>
+              <w:jc w:val="right"/>
+              <w:rPr>
+                <w:b/>
+                <w:bCs/>
+                <w:highlight w:val="yellow"/>
+                <w:lang w:val="id-ID"/>
+              </w:rPr>
+            </w:pPr>
+            <w:r>
+              <w:rPr>
+                <w:highlight w:val="yellow"/>
+                <w:lang w:val="id-ID"/>
+              </w:rPr>
+              <w:t>Rp......</w:t>
             </w:r>
           </w:p>
         </w:tc>
       </w:tr>
       <w:tr>
         <w:trPr>
-          <w:trHeight w:val="720"/>
+          <w:trHeight w:val="300"/>
         </w:trPr>
         <w:tc>
           <w:tcPr>
-            <w:tcW w:w="2707" w:type="dxa"/>
-            <w:vAlign w:val="center"/>
+            <w:tcW w:w="6033" w:type="dxa"/>
           </w:tcPr>
           <w:p>
             <w:pPr>
               <w:spacing w:line="276" w:lineRule="auto"/>
+              <w:jc w:val="both"/>
+              <w:rPr>
+                <w:lang w:val="id-ID"/>
+              </w:rPr>
             </w:pPr>
             <w:r>
-              <w:t>Banyaknya Uang</w:t>
-            </w:r>
-          </w:p>
-          <w:p>
-            <w:pPr>
-              <w:spacing w:line="276" w:lineRule="auto"/>
-            </w:pPr>
-            <w:r>
-              <w:t>(Termasuk PPN)</w:t>
+              <w:rPr>
+                <w:lang w:val="id-ID"/>
+              </w:rPr>
+              <w:t>Total</w:t>
             </w:r>
           </w:p>
         </w:tc>
         <w:tc>
           <w:tcPr>
-            <w:tcW w:w="275" w:type="dxa"/>
-            <w:vAlign w:val="center"/>
+            <w:tcW w:w="3436" w:type="dxa"/>
           </w:tcPr>
           <w:p>
             <w:pPr>
               <w:spacing w:line="276" w:lineRule="auto"/>
+              <w:jc w:val="right"/>
+              <w:rPr>
+                <w:highlight w:val="yellow"/>
+                <w:lang w:val="id-ID"/>
+              </w:rPr>
             </w:pPr>
             <w:r>
-              <w:t>:</w:t>
-            </w:r>
-          </w:p>
-        </w:tc>
-        <w:tc>
-          <w:tcPr>
-            <w:tcW w:w="6350" w:type="dxa"/>
-            <w:tcBorders>
-              <w:top w:val="single" w:sz="4" w:space="0" w:color="auto"/>
-              <w:bottom w:val="single" w:sz="4" w:space="0" w:color="auto"/>
-            </w:tcBorders>
-            <w:vAlign w:val="center"/>
-          </w:tcPr>
-          <w:p>
-            <w:pPr>
-              <w:spacing w:line="276" w:lineRule="auto"/>
-            </w:pPr>
-            <w:r>
+              <w:rPr>
+                <w:highlight w:val="yellow"/>
+                <w:lang w:val="id-ID"/>
+              </w:rPr>
               <w:t>Rp</w:t>
-            </w:r>
-            <w:r>
-              <w:t>1.298.753.502</w:t>
-            </w:r>
-          </w:p>
-        </w:tc>
-      </w:tr>
-      <w:tr>
-        <w:trPr>
-          <w:trHeight w:val="720"/>
-        </w:trPr>
-        <w:tc>
-          <w:tcPr>
-            <w:tcW w:w="2707" w:type="dxa"/>
-            <w:vAlign w:val="center"/>
-          </w:tcPr>
-          <w:p>
-            <w:pPr>
-              <w:spacing w:line="276" w:lineRule="auto"/>
-            </w:pPr>
-            <w:r>
-              <w:t>Terbilang</w:t>
-            </w:r>
-          </w:p>
-        </w:tc>
-        <w:tc>
-          <w:tcPr>
-            <w:tcW w:w="275" w:type="dxa"/>
-            <w:vAlign w:val="center"/>
-          </w:tcPr>
-          <w:p>
-            <w:pPr>
-              <w:spacing w:line="276" w:lineRule="auto"/>
-            </w:pPr>
-            <w:r>
-              <w:t>:</w:t>
-            </w:r>
-          </w:p>
-        </w:tc>
-        <w:tc>
-          <w:tcPr>
-            <w:tcW w:w="6350" w:type="dxa"/>
-            <w:tcBorders>
-              <w:top w:val="single" w:sz="4" w:space="0" w:color="auto"/>
-              <w:bottom w:val="single" w:sz="4" w:space="0" w:color="auto"/>
-            </w:tcBorders>
-            <w:vAlign w:val="center"/>
-          </w:tcPr>
-          <w:p>
-            <w:pPr>
-              <w:spacing w:line="276" w:lineRule="auto"/>
-              <w:jc w:val="both"/>
-            </w:pPr>
-            <w:r>
-              <w:t>Satu Miliar Dua Ratus Sembilan Puluh Delapan Juta Tujuh Ratus Lima Puluh Tiga Ribu Lima Ratus Dua</w:t>
-            </w:r>
-            <w:r>
-              <w:t xml:space="preserve"> Rupiah</w:t>
-            </w:r>
-          </w:p>
-        </w:tc>
-      </w:tr>
-      <w:tr>
-        <w:trPr>
-          <w:trHeight w:val="720"/>
-        </w:trPr>
-        <w:tc>
-          <w:tcPr>
-            <w:tcW w:w="2707" w:type="dxa"/>
-            <w:vAlign w:val="center"/>
-          </w:tcPr>
-          <w:p>
-            <w:pPr>
-              <w:spacing w:line="276" w:lineRule="auto"/>
-            </w:pPr>
-            <w:r>
-              <w:t>Untuk Pembayaran</w:t>
-            </w:r>
-          </w:p>
-        </w:tc>
-        <w:tc>
-          <w:tcPr>
-            <w:tcW w:w="275" w:type="dxa"/>
-            <w:vAlign w:val="center"/>
-          </w:tcPr>
-          <w:p>
-            <w:pPr>
-              <w:spacing w:line="276" w:lineRule="auto"/>
-            </w:pPr>
-            <w:r>
-              <w:t>:</w:t>
-            </w:r>
-          </w:p>
-        </w:tc>
-        <w:tc>
-          <w:tcPr>
-            <w:tcW w:w="6350" w:type="dxa"/>
-            <w:tcBorders>
-              <w:top w:val="single" w:sz="4" w:space="0" w:color="auto"/>
-              <w:bottom w:val="single" w:sz="4" w:space="0" w:color="auto"/>
-            </w:tcBorders>
-            <w:vAlign w:val="center"/>
-          </w:tcPr>
-          <w:p>
-            <w:pPr>
-              <w:spacing w:line="276" w:lineRule="auto"/>
-              <w:jc w:val="both"/>
-            </w:pPr>
-            <w:r>
-              <w:t xml:space="preserve">Pembelian TBS Kelapa Sawit sesuai </w:t>
-            </w:r>
-            <w:proofErr w:type="spellStart"/>
-            <w:r>
-              <w:t>Invoice</w:t>
-            </w:r>
-            <w:proofErr w:type="spellEnd"/>
-            <w:r>
-              <w:t xml:space="preserve"> No. R08D</w:t>
-            </w:r>
-            <w:r>
-              <w:t>-</w:t>
-            </w:r>
-            <w:r>
-              <w:t>RO/INV/2026.04.21-1</w:t>
             </w:r>
           </w:p>
         </w:tc>
@@ -294,337 +457,136 @@
     </w:tbl>
     <w:p>
       <w:pPr>
-        <w:spacing w:after="0" w:line="276" w:lineRule="auto"/>
-      </w:pPr>
+        <w:tabs>
+          <w:tab w:val="left" w:pos="709"/>
+          <w:tab w:val="left" w:pos="1418"/>
+        </w:tabs>
+        <w:spacing w:before="240" w:after="0" w:line="276" w:lineRule="auto"/>
+        <w:jc w:val="both"/>
+      </w:pPr>
+      <w:r>
+        <w:t>T</w:t>
+      </w:r>
+      <w:r>
+        <w:t>agihan</w:t>
+      </w:r>
+      <w:r>
+        <w:t xml:space="preserve"> </w:t>
+      </w:r>
+      <w:r>
+        <w:t xml:space="preserve">PBB </w:t>
+      </w:r>
+      <w:r>
+        <w:t xml:space="preserve">sebesar </w:t>
+      </w:r>
+      <w:r>
+        <w:rPr>
+          <w:highlight w:val="yellow"/>
+        </w:rPr>
+        <w:t xml:space="preserve">(Total PBB) </w:t>
+      </w:r>
+      <w:r>
+        <w:rPr>
+          <w:highlight w:val="yellow"/>
+        </w:rPr>
+        <w:t xml:space="preserve"> (</w:t>
+      </w:r>
+      <w:r>
+        <w:rPr>
+          <w:highlight w:val="yellow"/>
+        </w:rPr>
+        <w:t>Terbilang</w:t>
+      </w:r>
+      <w:r>
+        <w:rPr>
+          <w:highlight w:val="yellow"/>
+        </w:rPr>
+        <w:t>)</w:t>
+      </w:r>
+      <w:r>
+        <w:t xml:space="preserve"> </w:t>
+      </w:r>
+      <w:r>
+        <w:t xml:space="preserve">sebagaimana </w:t>
+      </w:r>
+      <w:proofErr w:type="spellStart"/>
+      <w:r>
+        <w:t>diatas</w:t>
+      </w:r>
+      <w:proofErr w:type="spellEnd"/>
+      <w:r>
+        <w:t xml:space="preserve">, </w:t>
+      </w:r>
+      <w:r>
+        <w:t>dapat segera dibayarkan melalui:</w:t>
+      </w:r>
     </w:p>
     <w:p>
       <w:pPr>
-        <w:spacing w:after="120" w:line="276" w:lineRule="auto"/>
-        <w:ind w:left="84"/>
-      </w:pPr>
-      <w:r>
-        <w:t>Melalui,</w:t>
+        <w:spacing w:before="240" w:after="0" w:line="276" w:lineRule="auto"/>
+        <w:jc w:val="both"/>
+      </w:pPr>
+      <w:r>
+        <w:t>Atas Nama</w:t>
+      </w:r>
+      <w:r>
+        <w:tab/>
+      </w:r>
+      <w:r>
+        <w:tab/>
+        <w:t xml:space="preserve">: PT Perkebunan Nusantara </w:t>
+      </w:r>
+      <w:r>
+        <w:t>I Regional 8</w:t>
       </w:r>
     </w:p>
-    <w:tbl>
-      <w:tblPr>
-        <w:tblStyle w:val="TableGrid"/>
-        <w:tblW w:w="0" w:type="auto"/>
-        <w:tblBorders>
-          <w:top w:val="none" w:sz="0" w:space="0" w:color="auto"/>
-          <w:left w:val="none" w:sz="0" w:space="0" w:color="auto"/>
-          <w:bottom w:val="none" w:sz="0" w:space="0" w:color="auto"/>
-          <w:right w:val="none" w:sz="0" w:space="0" w:color="auto"/>
-          <w:insideH w:val="none" w:sz="0" w:space="0" w:color="auto"/>
-          <w:insideV w:val="none" w:sz="0" w:space="0" w:color="auto"/>
-        </w:tblBorders>
-        <w:tblLook w:val="04A0" w:firstRow="1" w:lastRow="0" w:firstColumn="1" w:lastColumn="0" w:noHBand="0" w:noVBand="1"/>
-      </w:tblPr>
-      <w:tblGrid>
-        <w:gridCol w:w="2707"/>
-        <w:gridCol w:w="275"/>
-        <w:gridCol w:w="6350"/>
-      </w:tblGrid>
-      <w:tr>
-        <w:trPr>
-          <w:trHeight w:val="720"/>
-        </w:trPr>
-        <w:tc>
-          <w:tcPr>
-            <w:tcW w:w="2718" w:type="dxa"/>
-            <w:vAlign w:val="center"/>
-          </w:tcPr>
-          <w:p>
-            <w:pPr>
-              <w:spacing w:line="276" w:lineRule="auto"/>
-            </w:pPr>
-            <w:r>
-              <w:t>Bank Penerima</w:t>
-            </w:r>
-          </w:p>
-        </w:tc>
-        <w:tc>
-          <w:tcPr>
-            <w:tcW w:w="275" w:type="dxa"/>
-            <w:vAlign w:val="center"/>
-          </w:tcPr>
-          <w:p>
-            <w:pPr>
-              <w:spacing w:line="276" w:lineRule="auto"/>
-            </w:pPr>
-            <w:r>
-              <w:t>:</w:t>
-            </w:r>
-          </w:p>
-        </w:tc>
-        <w:tc>
-          <w:tcPr>
-            <w:tcW w:w="6385" w:type="dxa"/>
-            <w:tcBorders>
-              <w:bottom w:val="single" w:sz="4" w:space="0" w:color="auto"/>
-            </w:tcBorders>
-            <w:vAlign w:val="center"/>
-          </w:tcPr>
-          <w:p>
-            <w:pPr>
-              <w:spacing w:line="276" w:lineRule="auto"/>
-            </w:pPr>
-            <w:r>
-              <w:t xml:space="preserve">Bank Rakyat Indonesia </w:t>
-            </w:r>
-            <w:r>
-              <w:t>(BRI)</w:t>
-            </w:r>
-          </w:p>
-        </w:tc>
-      </w:tr>
-      <w:tr>
-        <w:trPr>
-          <w:trHeight w:val="720"/>
-        </w:trPr>
-        <w:tc>
-          <w:tcPr>
-            <w:tcW w:w="2718" w:type="dxa"/>
-            <w:vAlign w:val="center"/>
-          </w:tcPr>
-          <w:p>
-            <w:pPr>
-              <w:spacing w:line="276" w:lineRule="auto"/>
-            </w:pPr>
-            <w:r>
-              <w:t>Nama Pemilik Rekening</w:t>
-            </w:r>
-          </w:p>
-        </w:tc>
-        <w:tc>
-          <w:tcPr>
-            <w:tcW w:w="275" w:type="dxa"/>
-            <w:vAlign w:val="center"/>
-          </w:tcPr>
-          <w:p>
-            <w:pPr>
-              <w:spacing w:line="276" w:lineRule="auto"/>
-            </w:pPr>
-            <w:r>
-              <w:t>:</w:t>
-            </w:r>
-          </w:p>
-        </w:tc>
-        <w:tc>
-          <w:tcPr>
-            <w:tcW w:w="6385" w:type="dxa"/>
-            <w:tcBorders>
-              <w:top w:val="single" w:sz="4" w:space="0" w:color="auto"/>
-              <w:bottom w:val="single" w:sz="4" w:space="0" w:color="auto"/>
-            </w:tcBorders>
-            <w:vAlign w:val="center"/>
-          </w:tcPr>
-          <w:p>
-            <w:pPr>
-              <w:spacing w:line="276" w:lineRule="auto"/>
-            </w:pPr>
-            <w:r>
-              <w:t>PT Perkebunan Nusantara I Regional 8</w:t>
-            </w:r>
-          </w:p>
-        </w:tc>
-      </w:tr>
-      <w:tr>
-        <w:trPr>
-          <w:trHeight w:val="720"/>
-        </w:trPr>
-        <w:tc>
-          <w:tcPr>
-            <w:tcW w:w="2718" w:type="dxa"/>
-            <w:vAlign w:val="center"/>
-          </w:tcPr>
-          <w:p>
-            <w:pPr>
-              <w:spacing w:line="276" w:lineRule="auto"/>
-            </w:pPr>
-            <w:r>
-              <w:t>Nomor Rekening Penerima</w:t>
-            </w:r>
-          </w:p>
-        </w:tc>
-        <w:tc>
-          <w:tcPr>
-            <w:tcW w:w="275" w:type="dxa"/>
-            <w:vAlign w:val="center"/>
-          </w:tcPr>
-          <w:p>
-            <w:pPr>
-              <w:spacing w:line="276" w:lineRule="auto"/>
-            </w:pPr>
-            <w:r>
-              <w:t>:</w:t>
-            </w:r>
-          </w:p>
-        </w:tc>
-        <w:tc>
-          <w:tcPr>
-            <w:tcW w:w="6385" w:type="dxa"/>
-            <w:tcBorders>
-              <w:top w:val="single" w:sz="4" w:space="0" w:color="auto"/>
-              <w:bottom w:val="single" w:sz="4" w:space="0" w:color="auto"/>
-            </w:tcBorders>
-            <w:vAlign w:val="center"/>
-          </w:tcPr>
-          <w:p>
-            <w:pPr>
-              <w:spacing w:line="276" w:lineRule="auto"/>
-            </w:pPr>
-            <w:r>
-              <w:t>0050-01-005356-30-0</w:t>
-            </w:r>
-          </w:p>
-        </w:tc>
-      </w:tr>
-    </w:tbl>
     <w:p>
       <w:pPr>
         <w:spacing w:after="0" w:line="276" w:lineRule="auto"/>
         <w:jc w:val="both"/>
       </w:pPr>
+      <w:r>
+        <w:t>Nama Bank</w:t>
+      </w:r>
+      <w:r>
+        <w:tab/>
+      </w:r>
+      <w:r>
+        <w:tab/>
+        <w:t xml:space="preserve">: </w:t>
+      </w:r>
+      <w:r>
+        <w:t>Bank Rakyat Indonesia Cabang</w:t>
+      </w:r>
+      <w:r>
+        <w:t xml:space="preserve"> Ahmad Yani </w:t>
+      </w:r>
     </w:p>
     <w:p>
       <w:pPr>
+        <w:spacing w:line="276" w:lineRule="auto"/>
+        <w:jc w:val="both"/>
+      </w:pPr>
+      <w:r>
+        <w:t>Nomor Rekening</w:t>
+      </w:r>
+      <w:r>
+        <w:tab/>
+        <w:t>: 0050-01-005356-30-0</w:t>
+      </w:r>
+    </w:p>
+    <w:p>
+      <w:pPr>
         <w:spacing w:after="0" w:line="276" w:lineRule="auto"/>
         <w:jc w:val="both"/>
       </w:pPr>
+      <w:r>
+        <w:t>Demikian kami sampaikan, atas perhatian dan kerja sama yang baik diucapkan terima kasih.</w:t>
+      </w:r>
     </w:p>
-    <w:tbl>
-      <w:tblPr>
-        <w:tblStyle w:val="TableGrid"/>
-        <w:tblW w:w="0" w:type="auto"/>
-        <w:tblBorders>
-          <w:top w:val="none" w:sz="0" w:space="0" w:color="auto"/>
-          <w:left w:val="none" w:sz="0" w:space="0" w:color="auto"/>
-          <w:bottom w:val="none" w:sz="0" w:space="0" w:color="auto"/>
-          <w:right w:val="none" w:sz="0" w:space="0" w:color="auto"/>
-          <w:insideH w:val="none" w:sz="0" w:space="0" w:color="auto"/>
-          <w:insideV w:val="none" w:sz="0" w:space="0" w:color="auto"/>
-        </w:tblBorders>
-        <w:tblLook w:val="04A0" w:firstRow="1" w:lastRow="0" w:firstColumn="1" w:lastColumn="0" w:noHBand="0" w:noVBand="1"/>
-      </w:tblPr>
-      <w:tblGrid>
-        <w:gridCol w:w="4654"/>
-        <w:gridCol w:w="4678"/>
-      </w:tblGrid>
-      <w:tr>
-        <w:trPr>
-          <w:trHeight w:val="401"/>
-        </w:trPr>
-        <w:tc>
-          <w:tcPr>
-            <w:tcW w:w="4774" w:type="dxa"/>
-          </w:tcPr>
-          <w:p>
-            <w:pPr>
-              <w:spacing w:line="240" w:lineRule="auto"/>
-              <w:jc w:val="both"/>
-            </w:pPr>
-          </w:p>
-        </w:tc>
-        <w:tc>
-          <w:tcPr>
-            <w:tcW w:w="4774" w:type="dxa"/>
-          </w:tcPr>
-          <w:p>
-            <w:pPr>
-              <w:spacing w:line="240" w:lineRule="auto"/>
-              <w:jc w:val="center"/>
-            </w:pPr>
-            <w:r>
-              <w:t xml:space="preserve">Makassar, </w:t>
-            </w:r>
-            <w:r>
-              <w:t>21</w:t>
-            </w:r>
-            <w:r>
-              <w:t xml:space="preserve"> April</w:t>
-            </w:r>
-            <w:r>
-              <w:t xml:space="preserve"> 202</w:t>
-            </w:r>
-            <w:r>
-              <w:t>6</w:t>
-            </w:r>
-          </w:p>
-        </w:tc>
-      </w:tr>
-      <w:tr>
-        <w:trPr>
-          <w:trHeight w:val="1886"/>
-        </w:trPr>
-        <w:tc>
-          <w:tcPr>
-            <w:tcW w:w="4774" w:type="dxa"/>
-          </w:tcPr>
-          <w:p>
-            <w:pPr>
-              <w:spacing w:line="240" w:lineRule="auto"/>
-              <w:jc w:val="both"/>
-            </w:pPr>
-          </w:p>
-        </w:tc>
-        <w:tc>
-          <w:tcPr>
-            <w:tcW w:w="4774" w:type="dxa"/>
-          </w:tcPr>
-          <w:p>
-            <w:pPr>
-              <w:spacing w:line="240" w:lineRule="auto"/>
-              <w:jc w:val="center"/>
-              <w:rPr>
-                <w:b/>
-                <w:bCs/>
-                <w:i/>
-                <w:iCs/>
-              </w:rPr>
-            </w:pPr>
-          </w:p>
-        </w:tc>
-      </w:tr>
-      <w:tr>
-        <w:tc>
-          <w:tcPr>
-            <w:tcW w:w="4774" w:type="dxa"/>
-          </w:tcPr>
-          <w:p>
-            <w:pPr>
-              <w:spacing w:line="240" w:lineRule="auto"/>
-            </w:pPr>
-          </w:p>
-        </w:tc>
-        <w:tc>
-          <w:tcPr>
-            <w:tcW w:w="4774" w:type="dxa"/>
-            <w:vAlign w:val="bottom"/>
-          </w:tcPr>
-          <w:p>
-            <w:pPr>
-              <w:spacing w:line="240" w:lineRule="auto"/>
-              <w:jc w:val="center"/>
-              <w:rPr>
-                <w:i/>
-                <w:iCs/>
-              </w:rPr>
-            </w:pPr>
-          </w:p>
-        </w:tc>
-      </w:tr>
-    </w:tbl>
-    <w:p>
-      <w:pPr>
-        <w:spacing w:after="0" w:line="276" w:lineRule="auto"/>
-        <w:jc w:val="both"/>
-      </w:pPr>
-    </w:p>
-    <w:p/>
     <w:sectPr>
-      <w:headerReference w:type="default" r:id="rId6"/>
-      <w:footerReference w:type="default" r:id="rId7"/>
+      <w:headerReference w:type="default" r:id="rId7"/>
+      <w:footerReference w:type="default" r:id="rId8"/>
       <w:pgSz w:w="11906" w:h="16838"/>
       <w:pgMar w:top="1939" w:right="1134" w:bottom="1588" w:left="1440" w:header="709" w:footer="856" w:gutter="0"/>
       <w:cols w:space="708"/>
@@ -654,6 +616,13 @@
       <w:r>
         <w:continuationSeparator/>
       </w:r>
+    </w:p>
+  </w:endnote>
+  <w:endnote w:type="continuationNotice" w:id="1">
+    <w:p>
+      <w:pPr>
+        <w:spacing w:after="0" w:line="240" w:lineRule="auto"/>
+      </w:pPr>
     </w:p>
   </w:endnote>
 </w:endnotes>
@@ -691,7 +660,7 @@
       <mc:AlternateContent>
         <mc:Choice Requires="wps">
           <w:drawing>
-            <wp:anchor distT="45720" distB="45720" distL="114300" distR="114300" simplePos="0" relativeHeight="251661312" behindDoc="0" locked="0" layoutInCell="1" allowOverlap="1" wp14:anchorId="7B94C7D2" wp14:editId="6F1D10CD">
+            <wp:anchor distT="45720" distB="45720" distL="114300" distR="114300" simplePos="0" relativeHeight="251658242" behindDoc="0" locked="0" layoutInCell="1" allowOverlap="1" wp14:anchorId="548205FB" wp14:editId="6EAEE253">
               <wp:simplePos x="0" y="0"/>
               <wp:positionH relativeFrom="column">
                 <wp:posOffset>-847090</wp:posOffset>
@@ -702,7 +671,7 @@
               <wp:extent cx="3048000" cy="861060"/>
               <wp:effectExtent l="635" t="2540" r="0" b="3175"/>
               <wp:wrapSquare wrapText="bothSides"/>
-              <wp:docPr id="564420099" name="Rectangle 3"/>
+              <wp:docPr id="2112695717" name="Rectangle 3"/>
               <wp:cNvGraphicFramePr>
                 <a:graphicFrameLocks xmlns:a="http://schemas.openxmlformats.org/drawingml/2006/main"/>
               </wp:cNvGraphicFramePr>
@@ -786,7 +755,15 @@
                               <w:color w:val="000000"/>
                               <w:sz w:val="18"/>
                             </w:rPr>
-                            <w:t>Gedung Agro Plaza Lantai 14</w:t>
+                            <w:t>Gedung Agro Plaza Lantai 1</w:t>
+                          </w:r>
+                          <w:r>
+                            <w:rPr>
+                              <w:rFonts w:ascii="Arial Narrow" w:eastAsia="Arial Narrow" w:hAnsi="Arial Narrow" w:cs="Arial Narrow"/>
+                              <w:color w:val="000000"/>
+                              <w:sz w:val="18"/>
+                            </w:rPr>
+                            <w:t>4</w:t>
                           </w:r>
                         </w:p>
                         <w:p>
@@ -842,7 +819,7 @@
         </mc:Choice>
         <mc:Fallback>
           <w:pict>
-            <v:rect w14:anchorId="7B94C7D2" id="Rectangle 3" o:spid="_x0000_s1027" style="position:absolute;left:0;text-align:left;margin-left:-66.7pt;margin-top:-4.3pt;width:240pt;height:67.8pt;z-index:251661312;visibility:visible;mso-wrap-style:square;mso-width-percent:0;mso-height-percent:0;mso-wrap-distance-left:9pt;mso-wrap-distance-top:3.6pt;mso-wrap-distance-right:9pt;mso-wrap-distance-bottom:3.6pt;mso-position-horizontal:absolute;mso-position-horizontal-relative:text;mso-position-vertical:absolute;mso-position-vertical-relative:text;mso-width-percent:0;mso-height-percent:0;mso-width-relative:page;mso-height-relative:margin;v-text-anchor:top" o:gfxdata="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" filled="f" stroked="f">
+            <v:rect w14:anchorId="548205FB" id="Rectangle 3" o:spid="_x0000_s1027" style="position:absolute;left:0;text-align:left;margin-left:-66.7pt;margin-top:-4.3pt;width:240pt;height:67.8pt;z-index:251658242;visibility:visible;mso-wrap-style:square;mso-width-percent:0;mso-height-percent:0;mso-wrap-distance-left:9pt;mso-wrap-distance-top:3.6pt;mso-wrap-distance-right:9pt;mso-wrap-distance-bottom:3.6pt;mso-position-horizontal:absolute;mso-position-horizontal-relative:text;mso-position-vertical:absolute;mso-position-vertical-relative:text;mso-width-percent:0;mso-height-percent:0;mso-width-relative:page;mso-height-relative:margin;v-text-anchor:top" o:gfxdata="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" filled="f" stroked="f">
               <v:textbox inset="2.53958mm,1.2694mm,2.53958mm,1.2694mm">
                 <w:txbxContent>
                   <w:p>
@@ -950,7 +927,7 @@
         <w:lang w:eastAsia="id-ID"/>
       </w:rPr>
       <w:drawing>
-        <wp:anchor distT="0" distB="0" distL="0" distR="0" simplePos="0" relativeHeight="251659264" behindDoc="1" locked="0" layoutInCell="1" hidden="0" allowOverlap="1" wp14:anchorId="52C65E4A" wp14:editId="1F1C1CCB">
+        <wp:anchor distT="0" distB="0" distL="0" distR="0" simplePos="0" relativeHeight="251658240" behindDoc="1" locked="0" layoutInCell="1" hidden="0" allowOverlap="1" wp14:anchorId="4C7582D6" wp14:editId="532920B6">
           <wp:simplePos x="0" y="0"/>
           <wp:positionH relativeFrom="column">
             <wp:posOffset>-904874</wp:posOffset>
@@ -999,7 +976,7 @@
         <w:lang w:eastAsia="id-ID"/>
       </w:rPr>
       <w:drawing>
-        <wp:anchor distT="0" distB="0" distL="114300" distR="114300" simplePos="0" relativeHeight="251660288" behindDoc="0" locked="0" layoutInCell="1" hidden="0" allowOverlap="1" wp14:anchorId="14895E68" wp14:editId="74F77A45">
+        <wp:anchor distT="0" distB="0" distL="114300" distR="114300" simplePos="0" relativeHeight="251658241" behindDoc="0" locked="0" layoutInCell="1" hidden="0" allowOverlap="1" wp14:anchorId="6BD8BF34" wp14:editId="752C2CF7">
           <wp:simplePos x="0" y="0"/>
           <wp:positionH relativeFrom="column">
             <wp:posOffset>2269490</wp:posOffset>
@@ -1068,7 +1045,7 @@
       <mc:AlternateContent>
         <mc:Choice Requires="wps">
           <w:drawing>
-            <wp:anchor distT="0" distB="0" distL="114300" distR="114300" simplePos="0" relativeHeight="251662336" behindDoc="0" locked="0" layoutInCell="1" allowOverlap="1" wp14:anchorId="15C2BDE0" wp14:editId="0CC4949C">
+            <wp:anchor distT="0" distB="0" distL="114300" distR="114300" simplePos="0" relativeHeight="251658243" behindDoc="0" locked="0" layoutInCell="1" allowOverlap="1" wp14:anchorId="2299675E" wp14:editId="5EBC2F87">
               <wp:simplePos x="0" y="0"/>
               <wp:positionH relativeFrom="column">
                 <wp:posOffset>2628900</wp:posOffset>
@@ -1079,7 +1056,7 @@
               <wp:extent cx="4391660" cy="305435"/>
               <wp:effectExtent l="0" t="0" r="0" b="2540"/>
               <wp:wrapNone/>
-              <wp:docPr id="780133866" name="Rectangle 2"/>
+              <wp:docPr id="1030445872" name="Rectangle 1"/>
               <wp:cNvGraphicFramePr>
                 <a:graphicFrameLocks xmlns:a="http://schemas.openxmlformats.org/drawingml/2006/main"/>
               </wp:cNvGraphicFramePr>
@@ -1172,9 +1149,9 @@
             </wp:anchor>
           </w:drawing>
         </mc:Choice>
-        <mc:Fallback>
-          <w:pict>
-            <v:rect w14:anchorId="15C2BDE0" id="Rectangle 2" o:spid="_x0000_s1028" style="position:absolute;margin-left:207pt;margin-top:23pt;width:345.8pt;height:24.05pt;z-index:251662336;visibility:visible;mso-wrap-style:square;mso-width-percent:0;mso-height-percent:0;mso-wrap-distance-left:9pt;mso-wrap-distance-top:0;mso-wrap-distance-right:9pt;mso-wrap-distance-bottom:0;mso-position-horizontal:absolute;mso-position-horizontal-relative:text;mso-position-vertical:absolute;mso-position-vertical-relative:text;mso-width-percent:0;mso-height-percent:0;mso-width-relative:page;mso-height-relative:page;v-text-anchor:middle" o:gfxdata="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" filled="f" stroked="f">
+        <mc:Fallback xmlns:a="http://schemas.openxmlformats.org/drawingml/2006/main" xmlns:a14="http://schemas.microsoft.com/office/drawing/2010/main" xmlns:pic="http://schemas.openxmlformats.org/drawingml/2006/picture">
+          <w:pict w14:anchorId="115EACAE">
+            <v:rect id="Rectangle 1" style="position:absolute;margin-left:207pt;margin-top:23pt;width:345.8pt;height:24.05pt;z-index:251658243;visibility:visible;mso-wrap-style:square;mso-width-percent:0;mso-height-percent:0;mso-wrap-distance-left:9pt;mso-wrap-distance-top:0;mso-wrap-distance-right:9pt;mso-wrap-distance-bottom:0;mso-position-horizontal:absolute;mso-position-horizontal-relative:text;mso-position-vertical:absolute;mso-position-vertical-relative:text;mso-width-percent:0;mso-height-percent:0;mso-width-relative:page;mso-height-relative:page;v-text-anchor:middle" o:spid="_x0000_s1028" filled="f" stroked="f" w14:anchorId="2299675E" o:gfxdata="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">
               <v:textbox inset="2.53958mm,1.2694mm,2.53958mm,1.2694mm">
                 <w:txbxContent>
                   <w:p>
@@ -1185,7 +1162,7 @@
                     </w:pPr>
                     <w:r>
                       <w:rPr>
-                        <w:rFonts w:ascii="Arial Narrow" w:eastAsia="Arial Narrow" w:hAnsi="Arial Narrow" w:cs="Arial Narrow"/>
+                        <w:rFonts w:ascii="Arial Narrow" w:hAnsi="Arial Narrow" w:eastAsia="Arial Narrow" w:cs="Arial Narrow"/>
                         <w:b/>
                         <w:color w:val="3B9AEC"/>
                         <w:sz w:val="20"/>
@@ -1194,7 +1171,7 @@
                     </w:r>
                     <w:r>
                       <w:rPr>
-                        <w:rFonts w:ascii="Arial Narrow" w:eastAsia="Arial Narrow" w:hAnsi="Arial Narrow" w:cs="Arial Narrow"/>
+                        <w:rFonts w:ascii="Arial Narrow" w:hAnsi="Arial Narrow" w:eastAsia="Arial Narrow" w:cs="Arial Narrow"/>
                         <w:color w:val="000000"/>
                         <w:sz w:val="20"/>
                       </w:rPr>
@@ -1202,7 +1179,7 @@
                     </w:r>
                     <w:r>
                       <w:rPr>
-                        <w:rFonts w:ascii="Arial Narrow" w:eastAsia="Arial Narrow" w:hAnsi="Arial Narrow" w:cs="Arial Narrow"/>
+                        <w:rFonts w:ascii="Arial Narrow" w:hAnsi="Arial Narrow" w:eastAsia="Arial Narrow" w:cs="Arial Narrow"/>
                         <w:color w:val="000000"/>
                         <w:sz w:val="20"/>
                       </w:rPr>
@@ -1240,6 +1217,13 @@
       <w:r>
         <w:continuationSeparator/>
       </w:r>
+    </w:p>
+  </w:footnote>
+  <w:footnote w:type="continuationNotice" w:id="1">
+    <w:p>
+      <w:pPr>
+        <w:spacing w:after="0" w:line="240" w:lineRule="auto"/>
+      </w:pPr>
     </w:p>
   </w:footnote>
 </w:footnotes>
@@ -1272,7 +1256,7 @@
       <mc:AlternateContent>
         <mc:Choice Requires="wps">
           <w:drawing>
-            <wp:anchor distT="0" distB="0" distL="114300" distR="114300" simplePos="0" relativeHeight="251664384" behindDoc="0" locked="0" layoutInCell="1" allowOverlap="1" wp14:anchorId="44974DE9" wp14:editId="5303288E">
+            <wp:anchor distT="0" distB="0" distL="114300" distR="114300" simplePos="0" relativeHeight="251658245" behindDoc="0" locked="0" layoutInCell="1" allowOverlap="1" wp14:anchorId="606C84DA" wp14:editId="0BE9FD0C">
               <wp:simplePos x="0" y="0"/>
               <wp:positionH relativeFrom="column">
                 <wp:posOffset>-548640</wp:posOffset>
@@ -1283,7 +1267,7 @@
               <wp:extent cx="3909060" cy="695325"/>
               <wp:effectExtent l="13335" t="11430" r="11430" b="7620"/>
               <wp:wrapNone/>
-              <wp:docPr id="1217957147" name="Rectangle 1"/>
+              <wp:docPr id="701491427" name="Rectangle 1850843444"/>
               <wp:cNvGraphicFramePr>
                 <a:graphicFrameLocks xmlns:a="http://schemas.openxmlformats.org/drawingml/2006/main"/>
               </wp:cNvGraphicFramePr>
@@ -1424,9 +1408,9 @@
             </wp:anchor>
           </w:drawing>
         </mc:Choice>
-        <mc:Fallback>
-          <w:pict>
-            <v:rect w14:anchorId="44974DE9" id="Rectangle 1" o:spid="_x0000_s1026" style="position:absolute;margin-left:-43.2pt;margin-top:-17.85pt;width:307.8pt;height:54.75pt;z-index:251664384;visibility:visible;mso-wrap-style:square;mso-width-percent:0;mso-height-percent:0;mso-wrap-distance-left:9pt;mso-wrap-distance-top:0;mso-wrap-distance-right:9pt;mso-wrap-distance-bottom:0;mso-position-horizontal:absolute;mso-position-horizontal-relative:text;mso-position-vertical:absolute;mso-position-vertical-relative:text;mso-width-percent:0;mso-height-percent:0;mso-width-relative:margin;mso-height-relative:margin;v-text-anchor:top" o:gfxdata="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" filled="f" strokecolor="white">
+        <mc:Fallback xmlns:a="http://schemas.openxmlformats.org/drawingml/2006/main" xmlns:a14="http://schemas.microsoft.com/office/drawing/2010/main" xmlns:pic="http://schemas.openxmlformats.org/drawingml/2006/picture">
+          <w:pict w14:anchorId="2B97A5FA">
+            <v:rect id="Rectangle 1850843444" style="position:absolute;margin-left:-43.2pt;margin-top:-17.85pt;width:307.8pt;height:54.75pt;z-index:251658245;visibility:visible;mso-wrap-style:square;mso-width-percent:0;mso-height-percent:0;mso-wrap-distance-left:9pt;mso-wrap-distance-top:0;mso-wrap-distance-right:9pt;mso-wrap-distance-bottom:0;mso-position-horizontal:absolute;mso-position-horizontal-relative:text;mso-position-vertical:absolute;mso-position-vertical-relative:text;mso-width-percent:0;mso-height-percent:0;mso-width-relative:margin;mso-height-relative:margin;v-text-anchor:top" o:spid="_x0000_s1026" filled="f" strokecolor="white" w14:anchorId="606C84DA" o:gfxdata="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">
               <v:stroke startarrowwidth="narrow" startarrowlength="short" endarrowwidth="narrow" endarrowlength="short"/>
               <v:textbox inset="2.53958mm,1.2694mm,2.53958mm,1.2694mm">
                 <w:txbxContent>
@@ -1519,7 +1503,7 @@
         <w:lang w:eastAsia="id-ID"/>
       </w:rPr>
       <w:drawing>
-        <wp:anchor distT="0" distB="0" distL="114300" distR="114300" simplePos="0" relativeHeight="251663360" behindDoc="0" locked="0" layoutInCell="1" hidden="0" allowOverlap="1" wp14:anchorId="21E41C1A" wp14:editId="4716DA6D">
+        <wp:anchor distT="0" distB="0" distL="114300" distR="114300" simplePos="0" relativeHeight="251658244" behindDoc="0" locked="0" layoutInCell="1" hidden="0" allowOverlap="1" wp14:anchorId="7079A206" wp14:editId="0549ACE8">
           <wp:simplePos x="0" y="0"/>
           <wp:positionH relativeFrom="column">
             <wp:posOffset>5241290</wp:posOffset>
@@ -1576,6 +1560,282 @@
 </w:hdr>
 </file>
 
+<file path=word/numbering.xml><?xml version="1.0" encoding="utf-8"?>
+<w:numbering xmlns:wpc="http://schemas.microsoft.com/office/word/2010/wordprocessingCanvas" xmlns:cx="http://schemas.microsoft.com/office/drawing/2014/chartex" xmlns:cx1="http://schemas.microsoft.com/office/drawing/2015/9/8/chartex" xmlns:cx2="http://schemas.microsoft.com/office/drawing/2015/10/21/chartex" xmlns:cx3="http://schemas.microsoft.com/office/drawing/2016/5/9/chartex" xmlns:cx4="http://schemas.microsoft.com/office/drawing/2016/5/10/chartex" xmlns:cx5="http://schemas.microsoft.com/office/drawing/2016/5/11/chartex" xmlns:cx6="http://schemas.microsoft.com/office/drawing/2016/5/12/chartex" xmlns:cx7="http://schemas.microsoft.com/office/drawing/2016/5/13/chartex" xmlns:cx8="http://schemas.microsoft.com/office/drawing/2016/5/14/chartex" xmlns:mc="http://schemas.openxmlformats.org/markup-compatibility/2006" xmlns:aink="http://schemas.microsoft.com/office/drawing/2016/ink" xmlns:am3d="http://schemas.microsoft.com/office/drawing/2017/model3d" xmlns:o="urn:schemas-microsoft-com:office:office" xmlns:oel="http://schemas.microsoft.com/office/2019/extlst" xmlns:r="http://schemas.openxmlformats.org/officeDocument/2006/relationships" xmlns:m="http://schemas.openxmlformats.org/officeDocument/2006/math" xmlns:v="urn:schemas-microsoft-com:vml" xmlns:wp14="http://schemas.microsoft.com/office/word/2010/wordprocessingDrawing" xmlns:wp="http://schemas.openxmlformats.org/drawingml/2006/wordprocessingDrawing" xmlns:w10="urn:schemas-microsoft-com:office:word" xmlns:w="http://schemas.openxmlformats.org/wordprocessingml/2006/main" xmlns:w14="http://schemas.microsoft.com/office/word/2010/wordml" xmlns:w15="http://schemas.microsoft.com/office/word/2012/wordml" xmlns:w16cex="http://schemas.microsoft.com/office/word/2018/wordml/cex" xmlns:w16cid="http://schemas.microsoft.com/office/word/2016/wordml/cid" xmlns:w16="http://schemas.microsoft.com/office/word/2018/wordml" xmlns:w16du="http://schemas.microsoft.com/office/word/2023/wordml/word16du" xmlns:w16sdtdh="http://schemas.microsoft.com/office/word/2020/wordml/sdtdatahash" xmlns:w16sdtfl="http://schemas.microsoft.com/office/word/2024/wordml/sdtformatlock" xmlns:w16se="http://schemas.microsoft.com/office/word/2015/wordml/symex" xmlns:wpg="http://schemas.microsoft.com/office/word/2010/wordprocessingGroup" xmlns:wpi="http://schemas.microsoft.com/office/word/2010/wordprocessingInk" xmlns:wne="http://schemas.microsoft.com/office/word/2006/wordml" xmlns:wps="http://schemas.microsoft.com/office/word/2010/wordprocessingShape" mc:Ignorable="w14 w15 w16se w16cid w16 w16cex w16sdtdh w16sdtfl w16du wp14">
+  <w:abstractNum w:abstractNumId="0" w15:restartNumberingAfterBreak="0">
+    <w:nsid w:val="0A62114B"/>
+    <w:multiLevelType w:val="hybridMultilevel"/>
+    <w:tmpl w:val="1DB61FD2"/>
+    <w:lvl w:ilvl="0" w:tplc="04210017">
+      <w:start w:val="1"/>
+      <w:numFmt w:val="lowerLetter"/>
+      <w:lvlText w:val="%1)"/>
+      <w:lvlJc w:val="left"/>
+      <w:pPr>
+        <w:ind w:left="1440" w:hanging="360"/>
+      </w:pPr>
+    </w:lvl>
+    <w:lvl w:ilvl="1" w:tplc="04210019" w:tentative="1">
+      <w:start w:val="1"/>
+      <w:numFmt w:val="lowerLetter"/>
+      <w:lvlText w:val="%2."/>
+      <w:lvlJc w:val="left"/>
+      <w:pPr>
+        <w:ind w:left="2160" w:hanging="360"/>
+      </w:pPr>
+    </w:lvl>
+    <w:lvl w:ilvl="2" w:tplc="0421001B" w:tentative="1">
+      <w:start w:val="1"/>
+      <w:numFmt w:val="lowerRoman"/>
+      <w:lvlText w:val="%3."/>
+      <w:lvlJc w:val="right"/>
+      <w:pPr>
+        <w:ind w:left="2880" w:hanging="180"/>
+      </w:pPr>
+    </w:lvl>
+    <w:lvl w:ilvl="3" w:tplc="0421000F" w:tentative="1">
+      <w:start w:val="1"/>
+      <w:numFmt w:val="decimal"/>
+      <w:lvlText w:val="%4."/>
+      <w:lvlJc w:val="left"/>
+      <w:pPr>
+        <w:ind w:left="3600" w:hanging="360"/>
+      </w:pPr>
+    </w:lvl>
+    <w:lvl w:ilvl="4" w:tplc="04210019" w:tentative="1">
+      <w:start w:val="1"/>
+      <w:numFmt w:val="lowerLetter"/>
+      <w:lvlText w:val="%5."/>
+      <w:lvlJc w:val="left"/>
+      <w:pPr>
+        <w:ind w:left="4320" w:hanging="360"/>
+      </w:pPr>
+    </w:lvl>
+    <w:lvl w:ilvl="5" w:tplc="0421001B" w:tentative="1">
+      <w:start w:val="1"/>
+      <w:numFmt w:val="lowerRoman"/>
+      <w:lvlText w:val="%6."/>
+      <w:lvlJc w:val="right"/>
+      <w:pPr>
+        <w:ind w:left="5040" w:hanging="180"/>
+      </w:pPr>
+    </w:lvl>
+    <w:lvl w:ilvl="6" w:tplc="0421000F" w:tentative="1">
+      <w:start w:val="1"/>
+      <w:numFmt w:val="decimal"/>
+      <w:lvlText w:val="%7."/>
+      <w:lvlJc w:val="left"/>
+      <w:pPr>
+        <w:ind w:left="5760" w:hanging="360"/>
+      </w:pPr>
+    </w:lvl>
+    <w:lvl w:ilvl="7" w:tplc="04210019" w:tentative="1">
+      <w:start w:val="1"/>
+      <w:numFmt w:val="lowerLetter"/>
+      <w:lvlText w:val="%8."/>
+      <w:lvlJc w:val="left"/>
+      <w:pPr>
+        <w:ind w:left="6480" w:hanging="360"/>
+      </w:pPr>
+    </w:lvl>
+    <w:lvl w:ilvl="8" w:tplc="0421001B" w:tentative="1">
+      <w:start w:val="1"/>
+      <w:numFmt w:val="lowerRoman"/>
+      <w:lvlText w:val="%9."/>
+      <w:lvlJc w:val="right"/>
+      <w:pPr>
+        <w:ind w:left="7200" w:hanging="180"/>
+      </w:pPr>
+    </w:lvl>
+  </w:abstractNum>
+  <w:abstractNum w:abstractNumId="1" w15:restartNumberingAfterBreak="0">
+    <w:nsid w:val="64EA2694"/>
+    <w:multiLevelType w:val="hybridMultilevel"/>
+    <w:tmpl w:val="D74864E4"/>
+    <w:lvl w:ilvl="0" w:tplc="04210019">
+      <w:start w:val="1"/>
+      <w:numFmt w:val="lowerLetter"/>
+      <w:lvlText w:val="%1."/>
+      <w:lvlJc w:val="left"/>
+      <w:pPr>
+        <w:ind w:left="360" w:hanging="360"/>
+      </w:pPr>
+      <w:rPr>
+        <w:rFonts w:hint="default"/>
+        <w:b w:val="0"/>
+      </w:rPr>
+    </w:lvl>
+    <w:lvl w:ilvl="1" w:tplc="04210019" w:tentative="1">
+      <w:start w:val="1"/>
+      <w:numFmt w:val="lowerLetter"/>
+      <w:lvlText w:val="%2."/>
+      <w:lvlJc w:val="left"/>
+      <w:pPr>
+        <w:ind w:left="1080" w:hanging="360"/>
+      </w:pPr>
+    </w:lvl>
+    <w:lvl w:ilvl="2" w:tplc="0421001B" w:tentative="1">
+      <w:start w:val="1"/>
+      <w:numFmt w:val="lowerRoman"/>
+      <w:lvlText w:val="%3."/>
+      <w:lvlJc w:val="right"/>
+      <w:pPr>
+        <w:ind w:left="1800" w:hanging="180"/>
+      </w:pPr>
+    </w:lvl>
+    <w:lvl w:ilvl="3" w:tplc="0421000F" w:tentative="1">
+      <w:start w:val="1"/>
+      <w:numFmt w:val="decimal"/>
+      <w:lvlText w:val="%4."/>
+      <w:lvlJc w:val="left"/>
+      <w:pPr>
+        <w:ind w:left="2520" w:hanging="360"/>
+      </w:pPr>
+    </w:lvl>
+    <w:lvl w:ilvl="4" w:tplc="04210019" w:tentative="1">
+      <w:start w:val="1"/>
+      <w:numFmt w:val="lowerLetter"/>
+      <w:lvlText w:val="%5."/>
+      <w:lvlJc w:val="left"/>
+      <w:pPr>
+        <w:ind w:left="3240" w:hanging="360"/>
+      </w:pPr>
+    </w:lvl>
+    <w:lvl w:ilvl="5" w:tplc="0421001B" w:tentative="1">
+      <w:start w:val="1"/>
+      <w:numFmt w:val="lowerRoman"/>
+      <w:lvlText w:val="%6."/>
+      <w:lvlJc w:val="right"/>
+      <w:pPr>
+        <w:ind w:left="3960" w:hanging="180"/>
+      </w:pPr>
+    </w:lvl>
+    <w:lvl w:ilvl="6" w:tplc="0421000F" w:tentative="1">
+      <w:start w:val="1"/>
+      <w:numFmt w:val="decimal"/>
+      <w:lvlText w:val="%7."/>
+      <w:lvlJc w:val="left"/>
+      <w:pPr>
+        <w:ind w:left="4680" w:hanging="360"/>
+      </w:pPr>
+    </w:lvl>
+    <w:lvl w:ilvl="7" w:tplc="04210019" w:tentative="1">
+      <w:start w:val="1"/>
+      <w:numFmt w:val="lowerLetter"/>
+      <w:lvlText w:val="%8."/>
+      <w:lvlJc w:val="left"/>
+      <w:pPr>
+        <w:ind w:left="5400" w:hanging="360"/>
+      </w:pPr>
+    </w:lvl>
+    <w:lvl w:ilvl="8" w:tplc="0421001B" w:tentative="1">
+      <w:start w:val="1"/>
+      <w:numFmt w:val="lowerRoman"/>
+      <w:lvlText w:val="%9."/>
+      <w:lvlJc w:val="right"/>
+      <w:pPr>
+        <w:ind w:left="6120" w:hanging="180"/>
+      </w:pPr>
+    </w:lvl>
+  </w:abstractNum>
+  <w:abstractNum w:abstractNumId="2" w15:restartNumberingAfterBreak="0">
+    <w:nsid w:val="7F35611A"/>
+    <w:multiLevelType w:val="hybridMultilevel"/>
+    <w:tmpl w:val="C2224704"/>
+    <w:lvl w:ilvl="0" w:tplc="0421000F">
+      <w:start w:val="1"/>
+      <w:numFmt w:val="decimal"/>
+      <w:lvlText w:val="%1."/>
+      <w:lvlJc w:val="left"/>
+      <w:pPr>
+        <w:ind w:left="720" w:hanging="360"/>
+      </w:pPr>
+    </w:lvl>
+    <w:lvl w:ilvl="1" w:tplc="04210019" w:tentative="1">
+      <w:start w:val="1"/>
+      <w:numFmt w:val="lowerLetter"/>
+      <w:lvlText w:val="%2."/>
+      <w:lvlJc w:val="left"/>
+      <w:pPr>
+        <w:ind w:left="1440" w:hanging="360"/>
+      </w:pPr>
+    </w:lvl>
+    <w:lvl w:ilvl="2" w:tplc="0421001B" w:tentative="1">
+      <w:start w:val="1"/>
+      <w:numFmt w:val="lowerRoman"/>
+      <w:lvlText w:val="%3."/>
+      <w:lvlJc w:val="right"/>
+      <w:pPr>
+        <w:ind w:left="2160" w:hanging="180"/>
+      </w:pPr>
+    </w:lvl>
+    <w:lvl w:ilvl="3" w:tplc="0421000F" w:tentative="1">
+      <w:start w:val="1"/>
+      <w:numFmt w:val="decimal"/>
+      <w:lvlText w:val="%4."/>
+      <w:lvlJc w:val="left"/>
+      <w:pPr>
+        <w:ind w:left="2880" w:hanging="360"/>
+      </w:pPr>
+    </w:lvl>
+    <w:lvl w:ilvl="4" w:tplc="04210019" w:tentative="1">
+      <w:start w:val="1"/>
+      <w:numFmt w:val="lowerLetter"/>
+      <w:lvlText w:val="%5."/>
+      <w:lvlJc w:val="left"/>
+      <w:pPr>
+        <w:ind w:left="3600" w:hanging="360"/>
+      </w:pPr>
+    </w:lvl>
+    <w:lvl w:ilvl="5" w:tplc="0421001B" w:tentative="1">
+      <w:start w:val="1"/>
+      <w:numFmt w:val="lowerRoman"/>
+      <w:lvlText w:val="%6."/>
+      <w:lvlJc w:val="right"/>
+      <w:pPr>
+        <w:ind w:left="4320" w:hanging="180"/>
+      </w:pPr>
+    </w:lvl>
+    <w:lvl w:ilvl="6" w:tplc="0421000F" w:tentative="1">
+      <w:start w:val="1"/>
+      <w:numFmt w:val="decimal"/>
+      <w:lvlText w:val="%7."/>
+      <w:lvlJc w:val="left"/>
+      <w:pPr>
+        <w:ind w:left="5040" w:hanging="360"/>
+      </w:pPr>
+    </w:lvl>
+    <w:lvl w:ilvl="7" w:tplc="04210019" w:tentative="1">
+      <w:start w:val="1"/>
+      <w:numFmt w:val="lowerLetter"/>
+      <w:lvlText w:val="%8."/>
+      <w:lvlJc w:val="left"/>
+      <w:pPr>
+        <w:ind w:left="5760" w:hanging="360"/>
+      </w:pPr>
+    </w:lvl>
+    <w:lvl w:ilvl="8" w:tplc="0421001B" w:tentative="1">
+      <w:start w:val="1"/>
+      <w:numFmt w:val="lowerRoman"/>
+      <w:lvlText w:val="%9."/>
+      <w:lvlJc w:val="right"/>
+      <w:pPr>
+        <w:ind w:left="6480" w:hanging="180"/>
+      </w:pPr>
+    </w:lvl>
+  </w:abstractNum>
+  <w:num w:numId="1" w16cid:durableId="65496531">
+    <w:abstractNumId w:val="2"/>
+  </w:num>
+  <w:num w:numId="2" w16cid:durableId="1031371107">
+    <w:abstractNumId w:val="0"/>
+  </w:num>
+  <w:num w:numId="3" w16cid:durableId="2094623732">
+    <w:abstractNumId w:val="1"/>
+  </w:num>
+</w:numbering>
+</file>
+
 <file path=word/styles.xml><?xml version="1.0" encoding="utf-8"?>
 <w:styles xmlns:mc="http://schemas.openxmlformats.org/markup-compatibility/2006" xmlns:r="http://schemas.openxmlformats.org/officeDocument/2006/relationships" xmlns:w="http://schemas.openxmlformats.org/wordprocessingml/2006/main" xmlns:w14="http://schemas.microsoft.com/office/word/2010/wordml" xmlns:w15="http://schemas.microsoft.com/office/word/2012/wordml" xmlns:w16cex="http://schemas.microsoft.com/office/word/2018/wordml/cex" xmlns:w16cid="http://schemas.microsoft.com/office/word/2016/wordml/cid" xmlns:w16="http://schemas.microsoft.com/office/word/2018/wordml" xmlns:w16du="http://schemas.microsoft.com/office/word/2023/wordml/word16du" xmlns:w16sdtdh="http://schemas.microsoft.com/office/word/2020/wordml/sdtdatahash" xmlns:w16sdtfl="http://schemas.microsoft.com/office/word/2024/wordml/sdtformatlock" xmlns:w16se="http://schemas.microsoft.com/office/word/2015/wordml/symex" mc:Ignorable="w14 w15 w16se w16cid w16 w16cex w16sdtdh w16sdtfl w16du">
   <w:docDefaults>
@@ -1585,7 +1845,7 @@
         <w:kern w:val="2"/>
         <w:sz w:val="24"/>
         <w:szCs w:val="24"/>
-        <w:lang w:val="en-US" w:eastAsia="en-US" w:bidi="ar-SA"/>
+        <w:lang w:val="id-ID" w:eastAsia="en-US" w:bidi="ar-SA"/>
         <w14:ligatures w14:val="standardContextual"/>
       </w:rPr>
     </w:rPrDefault>
@@ -1976,7 +2236,7 @@
   <w:style w:type="paragraph" w:default="1" w:styleId="Normal">
     <w:name w:val="Normal"/>
     <w:qFormat/>
-    <w:rsid w:val="0018067B"/>
+    <w:rsid w:val="00861D0F"/>
     <w:pPr>
       <w:spacing w:line="259" w:lineRule="auto"/>
     </w:pPr>
@@ -1985,7 +2245,7 @@
       <w:kern w:val="0"/>
       <w:sz w:val="22"/>
       <w:szCs w:val="22"/>
-      <w:lang w:val="id-ID" w:eastAsia="en-ID"/>
+      <w:lang w:eastAsia="en-ID"/>
     </w:rPr>
   </w:style>
   <w:style w:type="paragraph" w:styleId="Heading1">
@@ -1995,20 +2255,18 @@
     <w:link w:val="Heading1Char"/>
     <w:uiPriority w:val="9"/>
     <w:qFormat/>
-    <w:rsid w:val="0018067B"/>
+    <w:rsid w:val="00561964"/>
     <w:pPr>
       <w:keepNext/>
       <w:keepLines/>
-      <w:spacing w:before="360" w:after="80" w:line="278" w:lineRule="auto"/>
+      <w:spacing w:before="360" w:after="80"/>
       <w:outlineLvl w:val="0"/>
     </w:pPr>
     <w:rPr>
       <w:rFonts w:asciiTheme="majorHAnsi" w:eastAsiaTheme="majorEastAsia" w:hAnsiTheme="majorHAnsi" w:cstheme="majorBidi"/>
       <w:color w:val="0F4761" w:themeColor="accent1" w:themeShade="BF"/>
-      <w:kern w:val="2"/>
       <w:sz w:val="40"/>
       <w:szCs w:val="40"/>
-      <w:lang w:eastAsia="en-US"/>
     </w:rPr>
   </w:style>
   <w:style w:type="paragraph" w:styleId="Heading2">
@@ -2020,20 +2278,18 @@
     <w:semiHidden/>
     <w:unhideWhenUsed/>
     <w:qFormat/>
-    <w:rsid w:val="0018067B"/>
+    <w:rsid w:val="00561964"/>
     <w:pPr>
       <w:keepNext/>
       <w:keepLines/>
-      <w:spacing w:before="160" w:after="80" w:line="278" w:lineRule="auto"/>
+      <w:spacing w:before="160" w:after="80"/>
       <w:outlineLvl w:val="1"/>
     </w:pPr>
     <w:rPr>
       <w:rFonts w:asciiTheme="majorHAnsi" w:eastAsiaTheme="majorEastAsia" w:hAnsiTheme="majorHAnsi" w:cstheme="majorBidi"/>
       <w:color w:val="0F4761" w:themeColor="accent1" w:themeShade="BF"/>
-      <w:kern w:val="2"/>
       <w:sz w:val="32"/>
       <w:szCs w:val="32"/>
-      <w:lang w:eastAsia="en-US"/>
     </w:rPr>
   </w:style>
   <w:style w:type="paragraph" w:styleId="Heading3">
@@ -2045,20 +2301,18 @@
     <w:semiHidden/>
     <w:unhideWhenUsed/>
     <w:qFormat/>
-    <w:rsid w:val="0018067B"/>
+    <w:rsid w:val="00561964"/>
     <w:pPr>
       <w:keepNext/>
       <w:keepLines/>
-      <w:spacing w:before="160" w:after="80" w:line="278" w:lineRule="auto"/>
+      <w:spacing w:before="160" w:after="80"/>
       <w:outlineLvl w:val="2"/>
     </w:pPr>
     <w:rPr>
-      <w:rFonts w:asciiTheme="minorHAnsi" w:eastAsiaTheme="majorEastAsia" w:hAnsiTheme="minorHAnsi" w:cstheme="majorBidi"/>
+      <w:rFonts w:eastAsiaTheme="majorEastAsia" w:cstheme="majorBidi"/>
       <w:color w:val="0F4761" w:themeColor="accent1" w:themeShade="BF"/>
-      <w:kern w:val="2"/>
       <w:sz w:val="28"/>
       <w:szCs w:val="28"/>
-      <w:lang w:eastAsia="en-US"/>
     </w:rPr>
   </w:style>
   <w:style w:type="paragraph" w:styleId="Heading4">
@@ -2070,22 +2324,18 @@
     <w:semiHidden/>
     <w:unhideWhenUsed/>
     <w:qFormat/>
-    <w:rsid w:val="0018067B"/>
+    <w:rsid w:val="00561964"/>
     <w:pPr>
       <w:keepNext/>
       <w:keepLines/>
-      <w:spacing w:before="80" w:after="40" w:line="278" w:lineRule="auto"/>
+      <w:spacing w:before="80" w:after="40"/>
       <w:outlineLvl w:val="3"/>
     </w:pPr>
     <w:rPr>
-      <w:rFonts w:asciiTheme="minorHAnsi" w:eastAsiaTheme="majorEastAsia" w:hAnsiTheme="minorHAnsi" w:cstheme="majorBidi"/>
+      <w:rFonts w:eastAsiaTheme="majorEastAsia" w:cstheme="majorBidi"/>
       <w:i/>
       <w:iCs/>
       <w:color w:val="0F4761" w:themeColor="accent1" w:themeShade="BF"/>
-      <w:kern w:val="2"/>
-      <w:sz w:val="24"/>
-      <w:szCs w:val="24"/>
-      <w:lang w:eastAsia="en-US"/>
     </w:rPr>
   </w:style>
   <w:style w:type="paragraph" w:styleId="Heading5">
@@ -2097,20 +2347,16 @@
     <w:semiHidden/>
     <w:unhideWhenUsed/>
     <w:qFormat/>
-    <w:rsid w:val="0018067B"/>
+    <w:rsid w:val="00561964"/>
     <w:pPr>
       <w:keepNext/>
       <w:keepLines/>
-      <w:spacing w:before="80" w:after="40" w:line="278" w:lineRule="auto"/>
+      <w:spacing w:before="80" w:after="40"/>
       <w:outlineLvl w:val="4"/>
     </w:pPr>
     <w:rPr>
-      <w:rFonts w:asciiTheme="minorHAnsi" w:eastAsiaTheme="majorEastAsia" w:hAnsiTheme="minorHAnsi" w:cstheme="majorBidi"/>
+      <w:rFonts w:eastAsiaTheme="majorEastAsia" w:cstheme="majorBidi"/>
       <w:color w:val="0F4761" w:themeColor="accent1" w:themeShade="BF"/>
-      <w:kern w:val="2"/>
-      <w:sz w:val="24"/>
-      <w:szCs w:val="24"/>
-      <w:lang w:eastAsia="en-US"/>
     </w:rPr>
   </w:style>
   <w:style w:type="paragraph" w:styleId="Heading6">
@@ -2122,22 +2368,18 @@
     <w:semiHidden/>
     <w:unhideWhenUsed/>
     <w:qFormat/>
-    <w:rsid w:val="0018067B"/>
+    <w:rsid w:val="00561964"/>
     <w:pPr>
       <w:keepNext/>
       <w:keepLines/>
-      <w:spacing w:before="40" w:after="0" w:line="278" w:lineRule="auto"/>
+      <w:spacing w:before="40" w:after="0"/>
       <w:outlineLvl w:val="5"/>
     </w:pPr>
     <w:rPr>
-      <w:rFonts w:asciiTheme="minorHAnsi" w:eastAsiaTheme="majorEastAsia" w:hAnsiTheme="minorHAnsi" w:cstheme="majorBidi"/>
+      <w:rFonts w:eastAsiaTheme="majorEastAsia" w:cstheme="majorBidi"/>
       <w:i/>
       <w:iCs/>
       <w:color w:val="595959" w:themeColor="text1" w:themeTint="A6"/>
-      <w:kern w:val="2"/>
-      <w:sz w:val="24"/>
-      <w:szCs w:val="24"/>
-      <w:lang w:eastAsia="en-US"/>
     </w:rPr>
   </w:style>
   <w:style w:type="paragraph" w:styleId="Heading7">
@@ -2149,20 +2391,16 @@
     <w:semiHidden/>
     <w:unhideWhenUsed/>
     <w:qFormat/>
-    <w:rsid w:val="0018067B"/>
+    <w:rsid w:val="00561964"/>
     <w:pPr>
       <w:keepNext/>
       <w:keepLines/>
-      <w:spacing w:before="40" w:after="0" w:line="278" w:lineRule="auto"/>
+      <w:spacing w:before="40" w:after="0"/>
       <w:outlineLvl w:val="6"/>
     </w:pPr>
     <w:rPr>
-      <w:rFonts w:asciiTheme="minorHAnsi" w:eastAsiaTheme="majorEastAsia" w:hAnsiTheme="minorHAnsi" w:cstheme="majorBidi"/>
+      <w:rFonts w:eastAsiaTheme="majorEastAsia" w:cstheme="majorBidi"/>
       <w:color w:val="595959" w:themeColor="text1" w:themeTint="A6"/>
-      <w:kern w:val="2"/>
-      <w:sz w:val="24"/>
-      <w:szCs w:val="24"/>
-      <w:lang w:eastAsia="en-US"/>
     </w:rPr>
   </w:style>
   <w:style w:type="paragraph" w:styleId="Heading8">
@@ -2174,22 +2412,18 @@
     <w:semiHidden/>
     <w:unhideWhenUsed/>
     <w:qFormat/>
-    <w:rsid w:val="0018067B"/>
+    <w:rsid w:val="00561964"/>
     <w:pPr>
       <w:keepNext/>
       <w:keepLines/>
-      <w:spacing w:after="0" w:line="278" w:lineRule="auto"/>
+      <w:spacing w:after="0"/>
       <w:outlineLvl w:val="7"/>
     </w:pPr>
     <w:rPr>
-      <w:rFonts w:asciiTheme="minorHAnsi" w:eastAsiaTheme="majorEastAsia" w:hAnsiTheme="minorHAnsi" w:cstheme="majorBidi"/>
+      <w:rFonts w:eastAsiaTheme="majorEastAsia" w:cstheme="majorBidi"/>
       <w:i/>
       <w:iCs/>
       <w:color w:val="272727" w:themeColor="text1" w:themeTint="D8"/>
-      <w:kern w:val="2"/>
-      <w:sz w:val="24"/>
-      <w:szCs w:val="24"/>
-      <w:lang w:eastAsia="en-US"/>
     </w:rPr>
   </w:style>
   <w:style w:type="paragraph" w:styleId="Heading9">
@@ -2201,20 +2435,16 @@
     <w:semiHidden/>
     <w:unhideWhenUsed/>
     <w:qFormat/>
-    <w:rsid w:val="0018067B"/>
+    <w:rsid w:val="00561964"/>
     <w:pPr>
       <w:keepNext/>
       <w:keepLines/>
-      <w:spacing w:after="0" w:line="278" w:lineRule="auto"/>
+      <w:spacing w:after="0"/>
       <w:outlineLvl w:val="8"/>
     </w:pPr>
     <w:rPr>
-      <w:rFonts w:asciiTheme="minorHAnsi" w:eastAsiaTheme="majorEastAsia" w:hAnsiTheme="minorHAnsi" w:cstheme="majorBidi"/>
+      <w:rFonts w:eastAsiaTheme="majorEastAsia" w:cstheme="majorBidi"/>
       <w:color w:val="272727" w:themeColor="text1" w:themeTint="D8"/>
-      <w:kern w:val="2"/>
-      <w:sz w:val="24"/>
-      <w:szCs w:val="24"/>
-      <w:lang w:eastAsia="en-US"/>
     </w:rPr>
   </w:style>
   <w:style w:type="character" w:default="1" w:styleId="DefaultParagraphFont">
@@ -2249,13 +2479,12 @@
     <w:basedOn w:val="DefaultParagraphFont"/>
     <w:link w:val="Heading1"/>
     <w:uiPriority w:val="9"/>
-    <w:rsid w:val="0018067B"/>
+    <w:rsid w:val="00561964"/>
     <w:rPr>
       <w:rFonts w:asciiTheme="majorHAnsi" w:eastAsiaTheme="majorEastAsia" w:hAnsiTheme="majorHAnsi" w:cstheme="majorBidi"/>
       <w:color w:val="0F4761" w:themeColor="accent1" w:themeShade="BF"/>
       <w:sz w:val="40"/>
       <w:szCs w:val="40"/>
-      <w:lang w:val="id-ID"/>
     </w:rPr>
   </w:style>
   <w:style w:type="character" w:customStyle="1" w:styleId="Heading2Char">
@@ -2264,13 +2493,12 @@
     <w:link w:val="Heading2"/>
     <w:uiPriority w:val="9"/>
     <w:semiHidden/>
-    <w:rsid w:val="0018067B"/>
+    <w:rsid w:val="00561964"/>
     <w:rPr>
       <w:rFonts w:asciiTheme="majorHAnsi" w:eastAsiaTheme="majorEastAsia" w:hAnsiTheme="majorHAnsi" w:cstheme="majorBidi"/>
       <w:color w:val="0F4761" w:themeColor="accent1" w:themeShade="BF"/>
       <w:sz w:val="32"/>
       <w:szCs w:val="32"/>
-      <w:lang w:val="id-ID"/>
     </w:rPr>
   </w:style>
   <w:style w:type="character" w:customStyle="1" w:styleId="Heading3Char">
@@ -2279,13 +2507,12 @@
     <w:link w:val="Heading3"/>
     <w:uiPriority w:val="9"/>
     <w:semiHidden/>
-    <w:rsid w:val="0018067B"/>
+    <w:rsid w:val="00561964"/>
     <w:rPr>
       <w:rFonts w:eastAsiaTheme="majorEastAsia" w:cstheme="majorBidi"/>
       <w:color w:val="0F4761" w:themeColor="accent1" w:themeShade="BF"/>
       <w:sz w:val="28"/>
       <w:szCs w:val="28"/>
-      <w:lang w:val="id-ID"/>
     </w:rPr>
   </w:style>
   <w:style w:type="character" w:customStyle="1" w:styleId="Heading4Char">
@@ -2294,13 +2521,12 @@
     <w:link w:val="Heading4"/>
     <w:uiPriority w:val="9"/>
     <w:semiHidden/>
-    <w:rsid w:val="0018067B"/>
+    <w:rsid w:val="00561964"/>
     <w:rPr>
       <w:rFonts w:eastAsiaTheme="majorEastAsia" w:cstheme="majorBidi"/>
       <w:i/>
       <w:iCs/>
       <w:color w:val="0F4761" w:themeColor="accent1" w:themeShade="BF"/>
-      <w:lang w:val="id-ID"/>
     </w:rPr>
   </w:style>
   <w:style w:type="character" w:customStyle="1" w:styleId="Heading5Char">
@@ -2309,11 +2535,10 @@
     <w:link w:val="Heading5"/>
     <w:uiPriority w:val="9"/>
     <w:semiHidden/>
-    <w:rsid w:val="0018067B"/>
+    <w:rsid w:val="00561964"/>
     <w:rPr>
       <w:rFonts w:eastAsiaTheme="majorEastAsia" w:cstheme="majorBidi"/>
       <w:color w:val="0F4761" w:themeColor="accent1" w:themeShade="BF"/>
-      <w:lang w:val="id-ID"/>
     </w:rPr>
   </w:style>
   <w:style w:type="character" w:customStyle="1" w:styleId="Heading6Char">
@@ -2322,13 +2547,12 @@
     <w:link w:val="Heading6"/>
     <w:uiPriority w:val="9"/>
     <w:semiHidden/>
-    <w:rsid w:val="0018067B"/>
+    <w:rsid w:val="00561964"/>
     <w:rPr>
       <w:rFonts w:eastAsiaTheme="majorEastAsia" w:cstheme="majorBidi"/>
       <w:i/>
       <w:iCs/>
       <w:color w:val="595959" w:themeColor="text1" w:themeTint="A6"/>
-      <w:lang w:val="id-ID"/>
     </w:rPr>
   </w:style>
   <w:style w:type="character" w:customStyle="1" w:styleId="Heading7Char">
@@ -2337,11 +2561,10 @@
     <w:link w:val="Heading7"/>
     <w:uiPriority w:val="9"/>
     <w:semiHidden/>
-    <w:rsid w:val="0018067B"/>
+    <w:rsid w:val="00561964"/>
     <w:rPr>
       <w:rFonts w:eastAsiaTheme="majorEastAsia" w:cstheme="majorBidi"/>
       <w:color w:val="595959" w:themeColor="text1" w:themeTint="A6"/>
-      <w:lang w:val="id-ID"/>
     </w:rPr>
   </w:style>
   <w:style w:type="character" w:customStyle="1" w:styleId="Heading8Char">
@@ -2350,13 +2573,12 @@
     <w:link w:val="Heading8"/>
     <w:uiPriority w:val="9"/>
     <w:semiHidden/>
-    <w:rsid w:val="0018067B"/>
+    <w:rsid w:val="00561964"/>
     <w:rPr>
       <w:rFonts w:eastAsiaTheme="majorEastAsia" w:cstheme="majorBidi"/>
       <w:i/>
       <w:iCs/>
       <w:color w:val="272727" w:themeColor="text1" w:themeTint="D8"/>
-      <w:lang w:val="id-ID"/>
     </w:rPr>
   </w:style>
   <w:style w:type="character" w:customStyle="1" w:styleId="Heading9Char">
@@ -2365,11 +2587,10 @@
     <w:link w:val="Heading9"/>
     <w:uiPriority w:val="9"/>
     <w:semiHidden/>
-    <w:rsid w:val="0018067B"/>
+    <w:rsid w:val="00561964"/>
     <w:rPr>
       <w:rFonts w:eastAsiaTheme="majorEastAsia" w:cstheme="majorBidi"/>
       <w:color w:val="272727" w:themeColor="text1" w:themeTint="D8"/>
-      <w:lang w:val="id-ID"/>
     </w:rPr>
   </w:style>
   <w:style w:type="paragraph" w:styleId="Title">
@@ -2379,7 +2600,7 @@
     <w:link w:val="TitleChar"/>
     <w:uiPriority w:val="10"/>
     <w:qFormat/>
-    <w:rsid w:val="0018067B"/>
+    <w:rsid w:val="00561964"/>
     <w:pPr>
       <w:spacing w:after="80" w:line="240" w:lineRule="auto"/>
       <w:contextualSpacing/>
@@ -2390,7 +2611,6 @@
       <w:kern w:val="28"/>
       <w:sz w:val="56"/>
       <w:szCs w:val="56"/>
-      <w:lang w:eastAsia="en-US"/>
     </w:rPr>
   </w:style>
   <w:style w:type="character" w:customStyle="1" w:styleId="TitleChar">
@@ -2398,14 +2618,13 @@
     <w:basedOn w:val="DefaultParagraphFont"/>
     <w:link w:val="Title"/>
     <w:uiPriority w:val="10"/>
-    <w:rsid w:val="0018067B"/>
+    <w:rsid w:val="00561964"/>
     <w:rPr>
       <w:rFonts w:asciiTheme="majorHAnsi" w:eastAsiaTheme="majorEastAsia" w:hAnsiTheme="majorHAnsi" w:cstheme="majorBidi"/>
       <w:spacing w:val="-10"/>
       <w:kern w:val="28"/>
       <w:sz w:val="56"/>
       <w:szCs w:val="56"/>
-      <w:lang w:val="id-ID"/>
     </w:rPr>
   </w:style>
   <w:style w:type="paragraph" w:styleId="Subtitle">
@@ -2415,36 +2634,32 @@
     <w:link w:val="SubtitleChar"/>
     <w:uiPriority w:val="11"/>
     <w:qFormat/>
-    <w:rsid w:val="0018067B"/>
+    <w:rsid w:val="00561964"/>
     <w:pPr>
       <w:numPr>
         <w:ilvl w:val="1"/>
       </w:numPr>
-      <w:spacing w:line="278" w:lineRule="auto"/>
     </w:pPr>
-    <w:rPr>
-      <w:rFonts w:asciiTheme="minorHAnsi" w:eastAsiaTheme="majorEastAsia" w:hAnsiTheme="minorHAnsi" w:cstheme="majorBidi"/>
-      <w:color w:val="595959" w:themeColor="text1" w:themeTint="A6"/>
-      <w:spacing w:val="15"/>
-      <w:kern w:val="2"/>
-      <w:sz w:val="28"/>
-      <w:szCs w:val="28"/>
-      <w:lang w:eastAsia="en-US"/>
-    </w:rPr>
-  </w:style>
-  <w:style w:type="character" w:customStyle="1" w:styleId="SubtitleChar">
-    <w:name w:val="Subtitle Char"/>
-    <w:basedOn w:val="DefaultParagraphFont"/>
-    <w:link w:val="Subtitle"/>
-    <w:uiPriority w:val="11"/>
-    <w:rsid w:val="0018067B"/>
     <w:rPr>
       <w:rFonts w:eastAsiaTheme="majorEastAsia" w:cstheme="majorBidi"/>
       <w:color w:val="595959" w:themeColor="text1" w:themeTint="A6"/>
       <w:spacing w:val="15"/>
       <w:sz w:val="28"/>
       <w:szCs w:val="28"/>
-      <w:lang w:val="id-ID"/>
+    </w:rPr>
+  </w:style>
+  <w:style w:type="character" w:customStyle="1" w:styleId="SubtitleChar">
+    <w:name w:val="Subtitle Char"/>
+    <w:basedOn w:val="DefaultParagraphFont"/>
+    <w:link w:val="Subtitle"/>
+    <w:uiPriority w:val="11"/>
+    <w:rsid w:val="00561964"/>
+    <w:rPr>
+      <w:rFonts w:eastAsiaTheme="majorEastAsia" w:cstheme="majorBidi"/>
+      <w:color w:val="595959" w:themeColor="text1" w:themeTint="A6"/>
+      <w:spacing w:val="15"/>
+      <w:sz w:val="28"/>
+      <w:szCs w:val="28"/>
     </w:rPr>
   </w:style>
   <w:style w:type="paragraph" w:styleId="Quote">
@@ -2454,20 +2669,15 @@
     <w:link w:val="QuoteChar"/>
     <w:uiPriority w:val="29"/>
     <w:qFormat/>
-    <w:rsid w:val="0018067B"/>
+    <w:rsid w:val="00561964"/>
     <w:pPr>
-      <w:spacing w:before="160" w:line="278" w:lineRule="auto"/>
+      <w:spacing w:before="160"/>
       <w:jc w:val="center"/>
     </w:pPr>
     <w:rPr>
-      <w:rFonts w:asciiTheme="minorHAnsi" w:eastAsiaTheme="minorHAnsi" w:hAnsiTheme="minorHAnsi" w:cstheme="minorBidi"/>
       <w:i/>
       <w:iCs/>
       <w:color w:val="404040" w:themeColor="text1" w:themeTint="BF"/>
-      <w:kern w:val="2"/>
-      <w:sz w:val="24"/>
-      <w:szCs w:val="24"/>
-      <w:lang w:eastAsia="en-US"/>
     </w:rPr>
   </w:style>
   <w:style w:type="character" w:customStyle="1" w:styleId="QuoteChar">
@@ -2475,39 +2685,31 @@
     <w:basedOn w:val="DefaultParagraphFont"/>
     <w:link w:val="Quote"/>
     <w:uiPriority w:val="29"/>
-    <w:rsid w:val="0018067B"/>
+    <w:rsid w:val="00561964"/>
     <w:rPr>
       <w:i/>
       <w:iCs/>
       <w:color w:val="404040" w:themeColor="text1" w:themeTint="BF"/>
-      <w:lang w:val="id-ID"/>
     </w:rPr>
   </w:style>
   <w:style w:type="paragraph" w:styleId="ListParagraph">
     <w:name w:val="List Paragraph"/>
     <w:basedOn w:val="Normal"/>
+    <w:link w:val="ListParagraphChar"/>
     <w:uiPriority w:val="34"/>
     <w:qFormat/>
-    <w:rsid w:val="0018067B"/>
+    <w:rsid w:val="00561964"/>
     <w:pPr>
-      <w:spacing w:line="278" w:lineRule="auto"/>
       <w:ind w:left="720"/>
       <w:contextualSpacing/>
     </w:pPr>
-    <w:rPr>
-      <w:rFonts w:asciiTheme="minorHAnsi" w:eastAsiaTheme="minorHAnsi" w:hAnsiTheme="minorHAnsi" w:cstheme="minorBidi"/>
-      <w:kern w:val="2"/>
-      <w:sz w:val="24"/>
-      <w:szCs w:val="24"/>
-      <w:lang w:eastAsia="en-US"/>
-    </w:rPr>
   </w:style>
   <w:style w:type="character" w:styleId="IntenseEmphasis">
     <w:name w:val="Intense Emphasis"/>
     <w:basedOn w:val="DefaultParagraphFont"/>
     <w:uiPriority w:val="21"/>
     <w:qFormat/>
-    <w:rsid w:val="0018067B"/>
+    <w:rsid w:val="00561964"/>
     <w:rPr>
       <w:i/>
       <w:iCs/>
@@ -2521,25 +2723,20 @@
     <w:link w:val="IntenseQuoteChar"/>
     <w:uiPriority w:val="30"/>
     <w:qFormat/>
-    <w:rsid w:val="0018067B"/>
+    <w:rsid w:val="00561964"/>
     <w:pPr>
       <w:pBdr>
         <w:top w:val="single" w:sz="4" w:space="10" w:color="0F4761" w:themeColor="accent1" w:themeShade="BF"/>
         <w:bottom w:val="single" w:sz="4" w:space="10" w:color="0F4761" w:themeColor="accent1" w:themeShade="BF"/>
       </w:pBdr>
-      <w:spacing w:before="360" w:after="360" w:line="278" w:lineRule="auto"/>
+      <w:spacing w:before="360" w:after="360"/>
       <w:ind w:left="864" w:right="864"/>
       <w:jc w:val="center"/>
     </w:pPr>
     <w:rPr>
-      <w:rFonts w:asciiTheme="minorHAnsi" w:eastAsiaTheme="minorHAnsi" w:hAnsiTheme="minorHAnsi" w:cstheme="minorBidi"/>
       <w:i/>
       <w:iCs/>
       <w:color w:val="0F4761" w:themeColor="accent1" w:themeShade="BF"/>
-      <w:kern w:val="2"/>
-      <w:sz w:val="24"/>
-      <w:szCs w:val="24"/>
-      <w:lang w:eastAsia="en-US"/>
     </w:rPr>
   </w:style>
   <w:style w:type="character" w:customStyle="1" w:styleId="IntenseQuoteChar">
@@ -2547,12 +2744,11 @@
     <w:basedOn w:val="DefaultParagraphFont"/>
     <w:link w:val="IntenseQuote"/>
     <w:uiPriority w:val="30"/>
-    <w:rsid w:val="0018067B"/>
+    <w:rsid w:val="00561964"/>
     <w:rPr>
       <w:i/>
       <w:iCs/>
       <w:color w:val="0F4761" w:themeColor="accent1" w:themeShade="BF"/>
-      <w:lang w:val="id-ID"/>
     </w:rPr>
   </w:style>
   <w:style w:type="character" w:styleId="IntenseReference">
@@ -2560,7 +2756,7 @@
     <w:basedOn w:val="DefaultParagraphFont"/>
     <w:uiPriority w:val="32"/>
     <w:qFormat/>
-    <w:rsid w:val="0018067B"/>
+    <w:rsid w:val="00561964"/>
     <w:rPr>
       <w:b/>
       <w:bCs/>
@@ -2575,7 +2771,7 @@
     <w:link w:val="HeaderChar"/>
     <w:uiPriority w:val="99"/>
     <w:unhideWhenUsed/>
-    <w:rsid w:val="0018067B"/>
+    <w:rsid w:val="00861D0F"/>
     <w:pPr>
       <w:tabs>
         <w:tab w:val="center" w:pos="4680"/>
@@ -2589,20 +2785,49 @@
     <w:basedOn w:val="DefaultParagraphFont"/>
     <w:link w:val="Header"/>
     <w:uiPriority w:val="99"/>
-    <w:rsid w:val="0018067B"/>
+    <w:rsid w:val="00861D0F"/>
     <w:rPr>
       <w:rFonts w:ascii="Calibri" w:eastAsia="Calibri" w:hAnsi="Calibri" w:cs="Calibri"/>
       <w:kern w:val="0"/>
       <w:sz w:val="22"/>
       <w:szCs w:val="22"/>
-      <w:lang w:val="id-ID" w:eastAsia="en-ID"/>
+      <w:lang w:val="en-US" w:eastAsia="en-ID"/>
+    </w:rPr>
+  </w:style>
+  <w:style w:type="paragraph" w:styleId="Footer">
+    <w:name w:val="footer"/>
+    <w:basedOn w:val="Normal"/>
+    <w:link w:val="FooterChar"/>
+    <w:uiPriority w:val="99"/>
+    <w:unhideWhenUsed/>
+    <w:rsid w:val="00861D0F"/>
+    <w:pPr>
+      <w:tabs>
+        <w:tab w:val="center" w:pos="4680"/>
+        <w:tab w:val="right" w:pos="9360"/>
+      </w:tabs>
+      <w:spacing w:after="0" w:line="240" w:lineRule="auto"/>
+    </w:pPr>
+  </w:style>
+  <w:style w:type="character" w:customStyle="1" w:styleId="FooterChar">
+    <w:name w:val="Footer Char"/>
+    <w:basedOn w:val="DefaultParagraphFont"/>
+    <w:link w:val="Footer"/>
+    <w:uiPriority w:val="99"/>
+    <w:rsid w:val="00861D0F"/>
+    <w:rPr>
+      <w:rFonts w:ascii="Calibri" w:eastAsia="Calibri" w:hAnsi="Calibri" w:cs="Calibri"/>
+      <w:kern w:val="0"/>
+      <w:sz w:val="22"/>
+      <w:szCs w:val="22"/>
+      <w:lang w:val="en-US" w:eastAsia="en-ID"/>
     </w:rPr>
   </w:style>
   <w:style w:type="table" w:styleId="TableGrid">
     <w:name w:val="Table Grid"/>
     <w:basedOn w:val="TableNormal"/>
     <w:uiPriority w:val="39"/>
-    <w:rsid w:val="0018067B"/>
+    <w:rsid w:val="00861D0F"/>
     <w:pPr>
       <w:spacing w:after="0" w:line="240" w:lineRule="auto"/>
     </w:pPr>
@@ -2611,7 +2836,7 @@
       <w:kern w:val="0"/>
       <w:sz w:val="22"/>
       <w:szCs w:val="22"/>
-      <w:lang w:eastAsia="en-ID"/>
+      <w:lang w:val="en-US" w:eastAsia="en-ID"/>
     </w:rPr>
     <w:tblPr>
       <w:tblBorders>
@@ -2624,34 +2849,11 @@
       </w:tblBorders>
     </w:tblPr>
   </w:style>
-  <w:style w:type="paragraph" w:styleId="Footer">
-    <w:name w:val="footer"/>
-    <w:basedOn w:val="Normal"/>
-    <w:link w:val="FooterChar"/>
-    <w:uiPriority w:val="99"/>
-    <w:unhideWhenUsed/>
-    <w:rsid w:val="0018067B"/>
-    <w:pPr>
-      <w:tabs>
-        <w:tab w:val="center" w:pos="4680"/>
-        <w:tab w:val="right" w:pos="9360"/>
-      </w:tabs>
-      <w:spacing w:after="0" w:line="240" w:lineRule="auto"/>
-    </w:pPr>
-  </w:style>
-  <w:style w:type="character" w:customStyle="1" w:styleId="FooterChar">
-    <w:name w:val="Footer Char"/>
-    <w:basedOn w:val="DefaultParagraphFont"/>
-    <w:link w:val="Footer"/>
-    <w:uiPriority w:val="99"/>
-    <w:rsid w:val="0018067B"/>
-    <w:rPr>
-      <w:rFonts w:ascii="Calibri" w:eastAsia="Calibri" w:hAnsi="Calibri" w:cs="Calibri"/>
-      <w:kern w:val="0"/>
-      <w:sz w:val="22"/>
-      <w:szCs w:val="22"/>
-      <w:lang w:val="id-ID" w:eastAsia="en-ID"/>
-    </w:rPr>
+  <w:style w:type="character" w:customStyle="1" w:styleId="ListParagraphChar">
+    <w:name w:val="List Paragraph Char"/>
+    <w:link w:val="ListParagraph"/>
+    <w:uiPriority w:val="34"/>
+    <w:rsid w:val="00861D0F"/>
   </w:style>
 </w:styles>
 </file>
@@ -2754,7 +2956,7 @@
         <a:latin typeface="Aptos" panose="02110004020202020204"/>
         <a:ea typeface=""/>
         <a:cs typeface=""/>
-        <a:font script="Jpan" typeface="游明朝"/>
+        <a:font script="Jpan" typeface="游ゴシック"/>
         <a:font script="Hang" typeface="맑은 고딕"/>
         <a:font script="Hans" typeface="等线"/>
         <a:font script="Hant" typeface="新細明體"/>
@@ -2862,6 +3064,13 @@
         </a:gradFill>
       </a:fillStyleLst>
       <a:lnStyleLst>
+        <a:ln w="6350" cap="flat" cmpd="sng" algn="ctr">
+          <a:solidFill>
+            <a:schemeClr val="phClr"/>
+          </a:solidFill>
+          <a:prstDash val="solid"/>
+          <a:miter lim="800000"/>
+        </a:ln>
         <a:ln w="12700" cap="flat" cmpd="sng" algn="ctr">
           <a:solidFill>
             <a:schemeClr val="phClr"/>
@@ -2870,13 +3079,6 @@
           <a:miter lim="800000"/>
         </a:ln>
         <a:ln w="19050" cap="flat" cmpd="sng" algn="ctr">
-          <a:solidFill>
-            <a:schemeClr val="phClr"/>
-          </a:solidFill>
-          <a:prstDash val="solid"/>
-          <a:miter lim="800000"/>
-        </a:ln>
-        <a:ln w="25400" cap="flat" cmpd="sng" algn="ctr">
           <a:solidFill>
             <a:schemeClr val="phClr"/>
           </a:solidFill>
@@ -2941,54 +3143,12 @@
       </a:bgFillStyleLst>
     </a:fmtScheme>
   </a:themeElements>
-  <a:objectDefaults>
-    <a:lnDef>
-      <a:spPr/>
-      <a:bodyPr/>
-      <a:lstStyle/>
-      <a:style>
-        <a:lnRef idx="2">
-          <a:schemeClr val="accent1"/>
-        </a:lnRef>
-        <a:fillRef idx="0">
-          <a:schemeClr val="accent1"/>
-        </a:fillRef>
-        <a:effectRef idx="1">
-          <a:schemeClr val="accent1"/>
-        </a:effectRef>
-        <a:fontRef idx="minor">
-          <a:schemeClr val="tx1"/>
-        </a:fontRef>
-      </a:style>
-    </a:lnDef>
-  </a:objectDefaults>
+  <a:objectDefaults/>
   <a:extraClrSchemeLst/>
   <a:extLst>
     <a:ext uri="{05A4C25C-085E-4340-85A3-A5531E510DB2}">
-      <thm15:themeFamily xmlns:thm15="http://schemas.microsoft.com/office/thememl/2012/main" name="Office Theme" id="{2E142A2C-CD16-42D6-873A-C26D2A0506FA}" vid="{1BDDFF52-6CD6-40A5-AB3C-68EB2F1E4D0A}"/>
+      <thm15:themeFamily xmlns:thm15="http://schemas.microsoft.com/office/thememl/2012/main" name="Office Theme" id="{62F939B6-93AF-4DB8-9C6B-D6C7DFDC589F}" vid="{4A3C46E8-61CC-4603-A589-7422A47A8E4A}"/>
     </a:ext>
   </a:extLst>
 </a:theme>
-</file>
-
-<file path=word/webextensions/taskpanes.xml><?xml version="1.0" encoding="utf-8"?>
-<wetp:taskpanes xmlns:wetp="http://schemas.microsoft.com/office/webextensions/taskpanes/2010/11">
-  <wetp:taskpane dockstate="right" visibility="0" width="438" row="1">
-    <wetp:webextensionref xmlns:r="http://schemas.openxmlformats.org/officeDocument/2006/relationships" r:id="rId1"/>
-  </wetp:taskpane>
-</wetp:taskpanes>
-</file>
-
-<file path=word/webextensions/webextension1.xml><?xml version="1.0" encoding="utf-8"?>
-<we:webextension xmlns:we="http://schemas.microsoft.com/office/webextensions/webextension/2010/11" id="{630A6770-781F-447B-B9B4-183FCEAD6AE3}">
-  <we:reference id="WA200010453" version="1.0.0.1" store="Omex" storeType="OMEX"/>
-  <we:alternateReferences>
-    <we:reference id="wa200010453" version="1.0.0.1" store="" storeType="OMEX"/>
-  </we:alternateReferences>
-  <we:properties>
-    <we:property name="claude.fileId" value="&quot;fd7fa5c4-22bd-497c-867e-2bb2615e9ae7&quot;"/>
-  </we:properties>
-  <we:bindings/>
-  <we:snapshot xmlns:r="http://schemas.openxmlformats.org/officeDocument/2006/relationships"/>
-</we:webextension>
 </file>
</xml_diff>